<commit_message>
now can define output_format when creating rules
</commit_message>
<xml_diff>
--- a/src/faultless/mysite/media/documents/Geotechnical_Report_MW-A58_anon_CORRUPTED_v3_modified.docx
+++ b/src/faultless/mysite/media/documents/Geotechnical_Report_MW-A58_anon_CORRUPTED_v3_modified.docx
@@ -1066,7 +1066,7 @@
             <w:pStyle w:val="TOC1"/>
             <w:numPr>
               <w:ilvl w:val="0"/>
-              <w:numId w:val="11"/>
+              <w:numId w:val="9"/>
             </w:numPr>
             <w:tabs>
               <w:tab w:val="left" w:pos="780"/>
@@ -1100,7 +1100,7 @@
             <w:pStyle w:val="TOC1"/>
             <w:numPr>
               <w:ilvl w:val="0"/>
-              <w:numId w:val="11"/>
+              <w:numId w:val="9"/>
             </w:numPr>
             <w:tabs>
               <w:tab w:val="left" w:pos="780"/>
@@ -1135,7 +1135,7 @@
             <w:pStyle w:val="TOC1"/>
             <w:numPr>
               <w:ilvl w:val="0"/>
-              <w:numId w:val="11"/>
+              <w:numId w:val="9"/>
             </w:numPr>
             <w:tabs>
               <w:tab w:val="left" w:pos="780"/>
@@ -1170,7 +1170,7 @@
             <w:pStyle w:val="TOC2"/>
             <w:numPr>
               <w:ilvl w:val="1"/>
-              <w:numId w:val="11"/>
+              <w:numId w:val="9"/>
             </w:numPr>
             <w:tabs>
               <w:tab w:val="left" w:pos="1219"/>
@@ -1214,7 +1214,7 @@
             <w:pStyle w:val="TOC1"/>
             <w:numPr>
               <w:ilvl w:val="0"/>
-              <w:numId w:val="11"/>
+              <w:numId w:val="9"/>
             </w:numPr>
             <w:tabs>
               <w:tab w:val="left" w:pos="780"/>
@@ -1267,7 +1267,7 @@
             <w:pStyle w:val="TOC2"/>
             <w:numPr>
               <w:ilvl w:val="1"/>
-              <w:numId w:val="11"/>
+              <w:numId w:val="9"/>
             </w:numPr>
             <w:tabs>
               <w:tab w:val="left" w:pos="1219"/>
@@ -1311,7 +1311,7 @@
             <w:pStyle w:val="TOC2"/>
             <w:numPr>
               <w:ilvl w:val="1"/>
-              <w:numId w:val="11"/>
+              <w:numId w:val="9"/>
             </w:numPr>
             <w:tabs>
               <w:tab w:val="left" w:pos="1219"/>
@@ -1355,7 +1355,7 @@
             <w:pStyle w:val="TOC2"/>
             <w:numPr>
               <w:ilvl w:val="1"/>
-              <w:numId w:val="11"/>
+              <w:numId w:val="9"/>
             </w:numPr>
             <w:tabs>
               <w:tab w:val="left" w:pos="1219"/>
@@ -1408,7 +1408,7 @@
             <w:pStyle w:val="TOC2"/>
             <w:numPr>
               <w:ilvl w:val="1"/>
-              <w:numId w:val="11"/>
+              <w:numId w:val="9"/>
             </w:numPr>
             <w:tabs>
               <w:tab w:val="left" w:pos="1219"/>
@@ -1443,7 +1443,7 @@
             <w:pStyle w:val="TOC2"/>
             <w:numPr>
               <w:ilvl w:val="1"/>
-              <w:numId w:val="11"/>
+              <w:numId w:val="9"/>
             </w:numPr>
             <w:tabs>
               <w:tab w:val="left" w:pos="1219"/>
@@ -1496,7 +1496,7 @@
             <w:pStyle w:val="TOC1"/>
             <w:numPr>
               <w:ilvl w:val="0"/>
-              <w:numId w:val="11"/>
+              <w:numId w:val="9"/>
             </w:numPr>
             <w:tabs>
               <w:tab w:val="left" w:pos="780"/>
@@ -1540,7 +1540,7 @@
             <w:pStyle w:val="TOC2"/>
             <w:numPr>
               <w:ilvl w:val="1"/>
-              <w:numId w:val="11"/>
+              <w:numId w:val="9"/>
             </w:numPr>
             <w:tabs>
               <w:tab w:val="left" w:pos="1219"/>
@@ -1575,7 +1575,7 @@
             <w:pStyle w:val="TOC2"/>
             <w:numPr>
               <w:ilvl w:val="1"/>
-              <w:numId w:val="11"/>
+              <w:numId w:val="9"/>
             </w:numPr>
             <w:tabs>
               <w:tab w:val="left" w:pos="1219"/>
@@ -1619,7 +1619,7 @@
             <w:pStyle w:val="TOC2"/>
             <w:numPr>
               <w:ilvl w:val="2"/>
-              <w:numId w:val="11"/>
+              <w:numId w:val="9"/>
             </w:numPr>
             <w:tabs>
               <w:tab w:val="left" w:pos="1219"/>
@@ -1654,7 +1654,7 @@
             <w:pStyle w:val="TOC2"/>
             <w:numPr>
               <w:ilvl w:val="2"/>
-              <w:numId w:val="11"/>
+              <w:numId w:val="9"/>
             </w:numPr>
             <w:tabs>
               <w:tab w:val="left" w:pos="1219"/>
@@ -1715,7 +1715,7 @@
             <w:pStyle w:val="TOC2"/>
             <w:numPr>
               <w:ilvl w:val="2"/>
-              <w:numId w:val="11"/>
+              <w:numId w:val="9"/>
             </w:numPr>
             <w:tabs>
               <w:tab w:val="left" w:pos="1219"/>
@@ -1759,7 +1759,7 @@
             <w:pStyle w:val="TOC2"/>
             <w:numPr>
               <w:ilvl w:val="2"/>
-              <w:numId w:val="11"/>
+              <w:numId w:val="9"/>
             </w:numPr>
             <w:tabs>
               <w:tab w:val="left" w:pos="1219"/>
@@ -1811,7 +1811,7 @@
             <w:pStyle w:val="TOC1"/>
             <w:numPr>
               <w:ilvl w:val="0"/>
-              <w:numId w:val="11"/>
+              <w:numId w:val="9"/>
             </w:numPr>
             <w:tabs>
               <w:tab w:val="left" w:pos="780"/>
@@ -1873,7 +1873,7 @@
             <w:pStyle w:val="TOC2"/>
             <w:numPr>
               <w:ilvl w:val="1"/>
-              <w:numId w:val="11"/>
+              <w:numId w:val="9"/>
             </w:numPr>
             <w:tabs>
               <w:tab w:val="left" w:pos="1219"/>
@@ -1935,7 +1935,7 @@
             <w:pStyle w:val="TOC2"/>
             <w:numPr>
               <w:ilvl w:val="1"/>
-              <w:numId w:val="11"/>
+              <w:numId w:val="9"/>
             </w:numPr>
             <w:tabs>
               <w:tab w:val="left" w:pos="1219"/>
@@ -1988,7 +1988,7 @@
             <w:pStyle w:val="TOC2"/>
             <w:numPr>
               <w:ilvl w:val="1"/>
-              <w:numId w:val="11"/>
+              <w:numId w:val="9"/>
             </w:numPr>
             <w:tabs>
               <w:tab w:val="left" w:pos="1219"/>
@@ -2041,7 +2041,7 @@
             <w:pStyle w:val="TOC2"/>
             <w:numPr>
               <w:ilvl w:val="1"/>
-              <w:numId w:val="11"/>
+              <w:numId w:val="9"/>
             </w:numPr>
             <w:tabs>
               <w:tab w:val="left" w:pos="1219"/>
@@ -2076,7 +2076,7 @@
             <w:pStyle w:val="TOC2"/>
             <w:numPr>
               <w:ilvl w:val="2"/>
-              <w:numId w:val="11"/>
+              <w:numId w:val="9"/>
             </w:numPr>
             <w:tabs>
               <w:tab w:val="left" w:pos="1219"/>
@@ -2111,7 +2111,7 @@
             <w:pStyle w:val="TOC2"/>
             <w:numPr>
               <w:ilvl w:val="2"/>
-              <w:numId w:val="11"/>
+              <w:numId w:val="9"/>
             </w:numPr>
             <w:tabs>
               <w:tab w:val="left" w:pos="1219"/>
@@ -2173,7 +2173,7 @@
             <w:pStyle w:val="TOC2"/>
             <w:numPr>
               <w:ilvl w:val="2"/>
-              <w:numId w:val="11"/>
+              <w:numId w:val="9"/>
             </w:numPr>
             <w:tabs>
               <w:tab w:val="left" w:pos="1219"/>
@@ -2207,7 +2207,7 @@
             <w:pStyle w:val="TOC2"/>
             <w:numPr>
               <w:ilvl w:val="2"/>
-              <w:numId w:val="11"/>
+              <w:numId w:val="9"/>
             </w:numPr>
             <w:tabs>
               <w:tab w:val="left" w:pos="1219"/>
@@ -2269,7 +2269,7 @@
             <w:pStyle w:val="TOC2"/>
             <w:numPr>
               <w:ilvl w:val="2"/>
-              <w:numId w:val="11"/>
+              <w:numId w:val="9"/>
             </w:numPr>
             <w:tabs>
               <w:tab w:val="left" w:pos="1219"/>
@@ -2322,7 +2322,7 @@
             <w:pStyle w:val="TOC2"/>
             <w:numPr>
               <w:ilvl w:val="1"/>
-              <w:numId w:val="11"/>
+              <w:numId w:val="9"/>
             </w:numPr>
             <w:tabs>
               <w:tab w:val="left" w:pos="1219"/>
@@ -2374,7 +2374,7 @@
             <w:pStyle w:val="TOC2"/>
             <w:numPr>
               <w:ilvl w:val="2"/>
-              <w:numId w:val="11"/>
+              <w:numId w:val="9"/>
             </w:numPr>
             <w:tabs>
               <w:tab w:val="left" w:pos="1219"/>
@@ -2409,7 +2409,7 @@
             <w:pStyle w:val="TOC2"/>
             <w:numPr>
               <w:ilvl w:val="2"/>
-              <w:numId w:val="11"/>
+              <w:numId w:val="9"/>
             </w:numPr>
             <w:tabs>
               <w:tab w:val="left" w:pos="1219"/>
@@ -2452,7 +2452,7 @@
             <w:pStyle w:val="TOC2"/>
             <w:numPr>
               <w:ilvl w:val="2"/>
-              <w:numId w:val="11"/>
+              <w:numId w:val="9"/>
             </w:numPr>
             <w:tabs>
               <w:tab w:val="left" w:pos="1219"/>
@@ -2559,7 +2559,7 @@
             <w:pStyle w:val="TOC2"/>
             <w:numPr>
               <w:ilvl w:val="2"/>
-              <w:numId w:val="11"/>
+              <w:numId w:val="9"/>
             </w:numPr>
             <w:tabs>
               <w:tab w:val="left" w:pos="1219"/>
@@ -2620,7 +2620,7 @@
             <w:pStyle w:val="TOC2"/>
             <w:numPr>
               <w:ilvl w:val="1"/>
-              <w:numId w:val="11"/>
+              <w:numId w:val="9"/>
             </w:numPr>
             <w:tabs>
               <w:tab w:val="left" w:pos="1219"/>
@@ -2655,7 +2655,7 @@
             <w:pStyle w:val="TOC2"/>
             <w:numPr>
               <w:ilvl w:val="1"/>
-              <w:numId w:val="11"/>
+              <w:numId w:val="9"/>
             </w:numPr>
             <w:tabs>
               <w:tab w:val="left" w:pos="1219"/>
@@ -2690,7 +2690,7 @@
             <w:pStyle w:val="TOC2"/>
             <w:numPr>
               <w:ilvl w:val="1"/>
-              <w:numId w:val="11"/>
+              <w:numId w:val="9"/>
             </w:numPr>
             <w:tabs>
               <w:tab w:val="left" w:pos="1219"/>
@@ -2734,7 +2734,7 @@
             <w:pStyle w:val="TOC2"/>
             <w:numPr>
               <w:ilvl w:val="2"/>
-              <w:numId w:val="11"/>
+              <w:numId w:val="9"/>
             </w:numPr>
             <w:tabs>
               <w:tab w:val="left" w:pos="1219"/>
@@ -2787,7 +2787,7 @@
             <w:pStyle w:val="TOC2"/>
             <w:numPr>
               <w:ilvl w:val="2"/>
-              <w:numId w:val="11"/>
+              <w:numId w:val="9"/>
             </w:numPr>
             <w:tabs>
               <w:tab w:val="left" w:pos="1219"/>
@@ -2830,7 +2830,7 @@
             <w:pStyle w:val="TOC2"/>
             <w:numPr>
               <w:ilvl w:val="2"/>
-              <w:numId w:val="11"/>
+              <w:numId w:val="9"/>
             </w:numPr>
             <w:tabs>
               <w:tab w:val="left" w:pos="1219"/>
@@ -2873,7 +2873,7 @@
             <w:pStyle w:val="TOC2"/>
             <w:numPr>
               <w:ilvl w:val="1"/>
-              <w:numId w:val="11"/>
+              <w:numId w:val="9"/>
             </w:numPr>
             <w:tabs>
               <w:tab w:val="left" w:pos="1219"/>
@@ -3170,7 +3170,7 @@
         <w:pStyle w:val="Heading1"/>
         <w:numPr>
           <w:ilvl w:val="1"/>
-          <w:numId w:val="14"/>
+          <w:numId w:val="12"/>
         </w:numPr>
         <w:tabs>
           <w:tab w:val="left" w:pos="1560"/>
@@ -3207,19 +3207,19 @@
         <w:spacing w:line="264" w:lineRule="auto"/>
         <w:ind w:left="120" w:right="210"/>
       </w:pPr>
-      <w:r>
-        <w:t xml:space="preserve">ClientCorp Ltd will also provide this report to build partners to </w:t>
-      </w:r>
       <w:commentRangeStart w:id="0"/>
       <w:r>
-        <w:t xml:space="preserve">inforft</w:t>
+        <w:t xml:space="preserve">ClientCorp Ltd will also provide this report to build partners to inforft them in assessing the suitability of the land for buildings.</w:t>
       </w:r>
       <w:commentRangeEnd w:id="0"/>
       <w:r>
         <w:commentReference w:id="0"/>
       </w:r>
       <w:r>
-        <w:t xml:space="preserve"> them in assessing the suitability of the land for buildings. This report:</w:t>
+        <w:commentReference w:id="1"/>
+      </w:r>
+      <w:r>
+        <w:t xml:space="preserve"> This report:</w:t>
       </w:r>
     </w:p>
     <w:p>
@@ -3227,7 +3227,7 @@
         <w:pStyle w:val="ListParagraph"/>
         <w:numPr>
           <w:ilvl w:val="2"/>
-          <w:numId w:val="14"/>
+          <w:numId w:val="12"/>
         </w:numPr>
         <w:tabs>
           <w:tab w:val="left" w:pos="480"/>
@@ -3244,7 +3244,7 @@
         <w:pStyle w:val="ListParagraph"/>
         <w:numPr>
           <w:ilvl w:val="2"/>
-          <w:numId w:val="14"/>
+          <w:numId w:val="12"/>
         </w:numPr>
         <w:tabs>
           <w:tab w:val="left" w:pos="480"/>
@@ -3261,7 +3261,7 @@
         <w:pStyle w:val="ListParagraph"/>
         <w:numPr>
           <w:ilvl w:val="2"/>
-          <w:numId w:val="14"/>
+          <w:numId w:val="12"/>
         </w:numPr>
         <w:tabs>
           <w:tab w:val="left" w:pos="480"/>
@@ -3312,7 +3312,7 @@
         <w:pStyle w:val="Heading1"/>
         <w:numPr>
           <w:ilvl w:val="0"/>
-          <w:numId w:val="5"/>
+          <w:numId w:val="3"/>
         </w:numPr>
         <w:tabs>
           <w:tab w:val="left" w:pos="1560"/>
@@ -6711,7 +6711,7 @@
               <w:pStyle w:val="TableParagraph"/>
               <w:numPr>
                 <w:ilvl w:val="0"/>
-                <w:numId w:val="9"/>
+                <w:numId w:val="7"/>
               </w:numPr>
               <w:tabs>
                 <w:tab w:val="left" w:pos="423"/>
@@ -6813,7 +6813,7 @@
               <w:pStyle w:val="TableParagraph"/>
               <w:numPr>
                 <w:ilvl w:val="0"/>
-                <w:numId w:val="9"/>
+                <w:numId w:val="7"/>
               </w:numPr>
               <w:tabs>
                 <w:tab w:val="left" w:pos="423"/>
@@ -6941,7 +6941,7 @@
               <w:pStyle w:val="TableParagraph"/>
               <w:numPr>
                 <w:ilvl w:val="0"/>
-                <w:numId w:val="9"/>
+                <w:numId w:val="7"/>
               </w:numPr>
               <w:tabs>
                 <w:tab w:val="left" w:pos="423"/>
@@ -9200,7 +9200,7 @@
         <w:pStyle w:val="Heading1"/>
         <w:numPr>
           <w:ilvl w:val="0"/>
-          <w:numId w:val="5"/>
+          <w:numId w:val="3"/>
         </w:numPr>
         <w:tabs>
           <w:tab w:val="left" w:pos="1560"/>
@@ -9270,13 +9270,13 @@
       <w:r>
         <w:t xml:space="preserve">This report supersedes any earlier geotechnical reports issued for the site. Land </w:t>
       </w:r>
-      <w:commentRangeStart w:id="1"/>
+      <w:commentRangeStart w:id="2"/>
       <w:r>
         <w:t xml:space="preserve">reftediation</w:t>
       </w:r>
-      <w:commentRangeEnd w:id="1"/>
-      <w:r>
-        <w:commentReference w:id="1"/>
+      <w:commentRangeEnd w:id="2"/>
+      <w:r>
+        <w:commentReference w:id="2"/>
       </w:r>
       <w:r>
         <w:t xml:space="preserve"> investigations have also been carried out by SolidEarth for the Evergreen West development area. The results and</w:t>
@@ -9288,7 +9288,18 @@
         <w:ind w:left="120"/>
       </w:pPr>
       <w:r>
-        <w:t xml:space="preserve">recommendations for land remediation are presented in a separate report, Land Remediation Investigation Report: Land Remediation Investigation Report: Evergreen West Development – Stages 2 &amp; 3 – Draft, dated March 2019 (version 1.0).</w:t>
+        <w:t xml:space="preserve">recommendations for land remediation are presented in a separate report, </w:t>
+      </w:r>
+      <w:commentRangeStart w:id="3"/>
+      <w:r>
+        <w:t xml:space="preserve">Land Remediation Investigation Report: Land Remediation Investigation Report:</w:t>
+      </w:r>
+      <w:commentRangeEnd w:id="3"/>
+      <w:r>
+        <w:commentReference w:id="3"/>
+      </w:r>
+      <w:r>
+        <w:t xml:space="preserve"> Evergreen West Development – Stages 2 &amp; 3 – Draft, dated March 2019 (version 1.0).</w:t>
       </w:r>
     </w:p>
     <w:p>
@@ -9302,7 +9313,7 @@
         <w:pStyle w:val="Heading2"/>
         <w:numPr>
           <w:ilvl w:val="1"/>
-          <w:numId w:val="5"/>
+          <w:numId w:val="3"/>
         </w:numPr>
         <w:tabs>
           <w:tab w:val="left" w:pos="840"/>
@@ -9365,13 +9376,13 @@
       <w:r>
         <w:t xml:space="preserve">If the nature of the proposed </w:t>
       </w:r>
-      <w:commentRangeStart w:id="2"/>
+      <w:commentRangeStart w:id="4"/>
       <w:r>
         <w:t xml:space="preserve">developftent</w:t>
       </w:r>
-      <w:commentRangeEnd w:id="2"/>
-      <w:r>
-        <w:commentReference w:id="2"/>
+      <w:commentRangeEnd w:id="4"/>
+      <w:r>
+        <w:commentReference w:id="4"/>
       </w:r>
       <w:r>
         <w:t xml:space="preserve"> differs from that assumed in this report, it is important that we are given the opportunity to revise the contents of this report.</w:t>
@@ -9395,7 +9406,7 @@
         <w:pStyle w:val="Heading1"/>
         <w:numPr>
           <w:ilvl w:val="0"/>
-          <w:numId w:val="5"/>
+          <w:numId w:val="3"/>
         </w:numPr>
         <w:tabs>
           <w:tab w:val="left" w:pos="1560"/>
@@ -9411,7 +9422,7 @@
         <w:pStyle w:val="Heading2"/>
         <w:numPr>
           <w:ilvl w:val="1"/>
-          <w:numId w:val="5"/>
+          <w:numId w:val="3"/>
         </w:numPr>
         <w:tabs>
           <w:tab w:val="left" w:pos="686"/>
@@ -9479,7 +9490,7 @@
         <w:pStyle w:val="Heading2"/>
         <w:numPr>
           <w:ilvl w:val="1"/>
-          <w:numId w:val="5"/>
+          <w:numId w:val="3"/>
         </w:numPr>
         <w:tabs>
           <w:tab w:val="left" w:pos="686"/>
@@ -9499,13 +9510,13 @@
       <w:r>
         <w:t xml:space="preserve">NZGD does not show any historical investigations in the </w:t>
       </w:r>
-      <w:commentRangeStart w:id="3"/>
+      <w:commentRangeStart w:id="5"/>
       <w:r>
         <w:t xml:space="preserve">iftmediate</w:t>
       </w:r>
-      <w:commentRangeEnd w:id="3"/>
-      <w:r>
-        <w:commentReference w:id="3"/>
+      <w:commentRangeEnd w:id="5"/>
+      <w:r>
+        <w:commentReference w:id="5"/>
       </w:r>
       <w:r>
         <w:t xml:space="preserve"> area (i.e. 100m radius) of the Superlot.</w:t>
@@ -9522,7 +9533,7 @@
         <w:pStyle w:val="Heading2"/>
         <w:numPr>
           <w:ilvl w:val="1"/>
-          <w:numId w:val="5"/>
+          <w:numId w:val="3"/>
         </w:numPr>
         <w:tabs>
           <w:tab w:val="left" w:pos="685"/>
@@ -12309,7 +12320,7 @@
         <w:pStyle w:val="ListParagraph"/>
         <w:numPr>
           <w:ilvl w:val="0"/>
-          <w:numId w:val="10"/>
+          <w:numId w:val="8"/>
         </w:numPr>
         <w:tabs>
           <w:tab w:val="left" w:pos="840"/>
@@ -12329,7 +12340,7 @@
         <w:pStyle w:val="ListParagraph"/>
         <w:numPr>
           <w:ilvl w:val="0"/>
-          <w:numId w:val="10"/>
+          <w:numId w:val="8"/>
         </w:numPr>
         <w:tabs>
           <w:tab w:val="left" w:pos="840"/>
@@ -12349,7 +12360,7 @@
         <w:pStyle w:val="ListParagraph"/>
         <w:numPr>
           <w:ilvl w:val="0"/>
-          <w:numId w:val="10"/>
+          <w:numId w:val="8"/>
         </w:numPr>
         <w:tabs>
           <w:tab w:val="left" w:pos="840"/>
@@ -12369,7 +12380,7 @@
         <w:pStyle w:val="ListParagraph"/>
         <w:numPr>
           <w:ilvl w:val="0"/>
-          <w:numId w:val="10"/>
+          <w:numId w:val="8"/>
         </w:numPr>
         <w:tabs>
           <w:tab w:val="left" w:pos="840"/>
@@ -12399,7 +12410,7 @@
         <w:pStyle w:val="Heading2"/>
         <w:numPr>
           <w:ilvl w:val="1"/>
-          <w:numId w:val="5"/>
+          <w:numId w:val="3"/>
         </w:numPr>
         <w:tabs>
           <w:tab w:val="left" w:pos="684"/>
@@ -12441,7 +12452,7 @@
         <w:pStyle w:val="Heading2"/>
         <w:numPr>
           <w:ilvl w:val="1"/>
-          <w:numId w:val="5"/>
+          <w:numId w:val="3"/>
         </w:numPr>
         <w:tabs>
           <w:tab w:val="left" w:pos="686"/>
@@ -13141,7 +13152,7 @@
         <w:pStyle w:val="Heading1"/>
         <w:numPr>
           <w:ilvl w:val="0"/>
-          <w:numId w:val="5"/>
+          <w:numId w:val="3"/>
         </w:numPr>
         <w:tabs>
           <w:tab w:val="left" w:pos="1560"/>
@@ -13157,7 +13168,7 @@
         <w:pStyle w:val="Heading2"/>
         <w:numPr>
           <w:ilvl w:val="1"/>
-          <w:numId w:val="5"/>
+          <w:numId w:val="3"/>
         </w:numPr>
         <w:tabs>
           <w:tab w:val="left" w:pos="685"/>
@@ -14449,7 +14460,7 @@
         <w:pStyle w:val="Heading2"/>
         <w:numPr>
           <w:ilvl w:val="1"/>
-          <w:numId w:val="5"/>
+          <w:numId w:val="3"/>
         </w:numPr>
         <w:tabs>
           <w:tab w:val="left" w:pos="685"/>
@@ -14465,7 +14476,7 @@
         <w:pStyle w:val="ListParagraph"/>
         <w:numPr>
           <w:ilvl w:val="2"/>
-          <w:numId w:val="5"/>
+          <w:numId w:val="3"/>
         </w:numPr>
         <w:tabs>
           <w:tab w:val="left" w:pos="1200"/>
@@ -14522,7 +14533,7 @@
         <w:pStyle w:val="ListParagraph"/>
         <w:numPr>
           <w:ilvl w:val="2"/>
-          <w:numId w:val="5"/>
+          <w:numId w:val="3"/>
         </w:numPr>
         <w:tabs>
           <w:tab w:val="left" w:pos="1200"/>
@@ -14587,18 +14598,7 @@
         <w:ind w:left="120" w:right="590"/>
       </w:pPr>
       <w:r>
-        <w:t xml:space="preserve">significant variance in the undrained shear strengths of this material, with results ranging from 17 to 200 </w:t>
-      </w:r>
-      <w:commentRangeStart w:id="4"/>
-      <w:r>
-        <w:t xml:space="preserve">psi</w:t>
-      </w:r>
-      <w:commentRangeEnd w:id="4"/>
-      <w:r>
-        <w:commentReference w:id="4"/>
-      </w:r>
-      <w:r>
-        <w:t xml:space="preserve">.</w:t>
+        <w:t xml:space="preserve">significant variance in the undrained shear strengths of this material, with results ranging from 17 to 200 psi.</w:t>
       </w:r>
     </w:p>
     <w:p>
@@ -14632,7 +14632,7 @@
         <w:pStyle w:val="ListParagraph"/>
         <w:numPr>
           <w:ilvl w:val="2"/>
-          <w:numId w:val="5"/>
+          <w:numId w:val="3"/>
         </w:numPr>
         <w:tabs>
           <w:tab w:val="left" w:pos="1200"/>
@@ -14730,7 +14730,7 @@
         <w:pStyle w:val="ListParagraph"/>
         <w:numPr>
           <w:ilvl w:val="2"/>
-          <w:numId w:val="5"/>
+          <w:numId w:val="3"/>
         </w:numPr>
         <w:tabs>
           <w:tab w:val="left" w:pos="1200"/>
@@ -14805,7 +14805,7 @@
         <w:pStyle w:val="ListParagraph"/>
         <w:numPr>
           <w:ilvl w:val="0"/>
-          <w:numId w:val="5"/>
+          <w:numId w:val="3"/>
         </w:numPr>
         <w:tabs>
           <w:tab w:val="left" w:pos="1560"/>
@@ -14838,7 +14838,7 @@
         <w:pStyle w:val="Heading2"/>
         <w:numPr>
           <w:ilvl w:val="1"/>
-          <w:numId w:val="5"/>
+          <w:numId w:val="3"/>
         </w:numPr>
         <w:tabs>
           <w:tab w:val="left" w:pos="685"/>
@@ -14871,7 +14871,7 @@
         <w:pStyle w:val="Heading2"/>
         <w:numPr>
           <w:ilvl w:val="1"/>
-          <w:numId w:val="5"/>
+          <w:numId w:val="3"/>
         </w:numPr>
         <w:tabs>
           <w:tab w:val="left" w:pos="685"/>
@@ -14887,7 +14887,7 @@
         <w:pStyle w:val="ListParagraph"/>
         <w:numPr>
           <w:ilvl w:val="0"/>
-          <w:numId w:val="16"/>
+          <w:numId w:val="14"/>
         </w:numPr>
         <w:tabs>
           <w:tab w:val="left" w:pos="480"/>
@@ -14904,7 +14904,7 @@
         <w:pStyle w:val="ListParagraph"/>
         <w:numPr>
           <w:ilvl w:val="0"/>
-          <w:numId w:val="16"/>
+          <w:numId w:val="14"/>
         </w:numPr>
         <w:tabs>
           <w:tab w:val="left" w:pos="480"/>
@@ -14921,7 +14921,7 @@
         <w:pStyle w:val="ListParagraph"/>
         <w:numPr>
           <w:ilvl w:val="0"/>
-          <w:numId w:val="16"/>
+          <w:numId w:val="14"/>
         </w:numPr>
         <w:tabs>
           <w:tab w:val="left" w:pos="480"/>
@@ -14938,7 +14938,7 @@
         <w:pStyle w:val="ListParagraph"/>
         <w:numPr>
           <w:ilvl w:val="0"/>
-          <w:numId w:val="16"/>
+          <w:numId w:val="14"/>
         </w:numPr>
         <w:tabs>
           <w:tab w:val="left" w:pos="480"/>
@@ -14955,7 +14955,7 @@
         <w:pStyle w:val="ListParagraph"/>
         <w:numPr>
           <w:ilvl w:val="0"/>
-          <w:numId w:val="16"/>
+          <w:numId w:val="14"/>
         </w:numPr>
         <w:tabs>
           <w:tab w:val="left" w:pos="480"/>
@@ -14972,7 +14972,7 @@
         <w:pStyle w:val="ListParagraph"/>
         <w:numPr>
           <w:ilvl w:val="0"/>
-          <w:numId w:val="16"/>
+          <w:numId w:val="14"/>
         </w:numPr>
         <w:tabs>
           <w:tab w:val="left" w:pos="480"/>
@@ -14980,13 +14980,13 @@
         <w:spacing w:before="106"/>
         <w:ind w:hanging="360"/>
       </w:pPr>
-      <w:commentRangeStart w:id="5"/>
+      <w:commentRangeStart w:id="6"/>
       <w:r>
         <w:t xml:space="preserve">Coftpressible</w:t>
       </w:r>
-      <w:commentRangeEnd w:id="5"/>
-      <w:r>
-        <w:commentReference w:id="5"/>
+      <w:commentRangeEnd w:id="6"/>
+      <w:r>
+        <w:commentReference w:id="6"/>
       </w:r>
       <w:r>
         <w:t xml:space="preserve"> soils and settlement</w:t>
@@ -14997,7 +14997,7 @@
         <w:pStyle w:val="ListParagraph"/>
         <w:numPr>
           <w:ilvl w:val="0"/>
-          <w:numId w:val="16"/>
+          <w:numId w:val="14"/>
         </w:numPr>
         <w:tabs>
           <w:tab w:val="left" w:pos="480"/>
@@ -15014,7 +15014,7 @@
         <w:pStyle w:val="ListParagraph"/>
         <w:numPr>
           <w:ilvl w:val="0"/>
-          <w:numId w:val="16"/>
+          <w:numId w:val="14"/>
         </w:numPr>
         <w:tabs>
           <w:tab w:val="left" w:pos="480"/>
@@ -15031,7 +15031,7 @@
         <w:pStyle w:val="ListParagraph"/>
         <w:numPr>
           <w:ilvl w:val="0"/>
-          <w:numId w:val="16"/>
+          <w:numId w:val="14"/>
         </w:numPr>
         <w:tabs>
           <w:tab w:val="left" w:pos="480"/>
@@ -15048,7 +15048,7 @@
         <w:pStyle w:val="ListParagraph"/>
         <w:numPr>
           <w:ilvl w:val="0"/>
-          <w:numId w:val="16"/>
+          <w:numId w:val="14"/>
         </w:numPr>
         <w:tabs>
           <w:tab w:val="left" w:pos="480"/>
@@ -15059,13 +15059,13 @@
       <w:r>
         <w:t xml:space="preserve">Subgrade for </w:t>
       </w:r>
-      <w:commentRangeStart w:id="6"/>
+      <w:commentRangeStart w:id="7"/>
       <w:r>
         <w:t xml:space="preserve">paveftents</w:t>
       </w:r>
-      <w:commentRangeEnd w:id="6"/>
-      <w:r>
-        <w:commentReference w:id="6"/>
+      <w:commentRangeEnd w:id="7"/>
+      <w:r>
+        <w:commentReference w:id="7"/>
       </w:r>
       <w:r>
         <w:t xml:space="preserve">.</w:t>
@@ -15076,7 +15076,7 @@
         <w:pStyle w:val="ListParagraph"/>
         <w:numPr>
           <w:ilvl w:val="0"/>
-          <w:numId w:val="16"/>
+          <w:numId w:val="14"/>
         </w:numPr>
         <w:tabs>
           <w:tab w:val="left" w:pos="480"/>
@@ -15099,7 +15099,7 @@
         <w:pStyle w:val="Heading2"/>
         <w:numPr>
           <w:ilvl w:val="1"/>
-          <w:numId w:val="5"/>
+          <w:numId w:val="3"/>
         </w:numPr>
         <w:tabs>
           <w:tab w:val="left" w:pos="685"/>
@@ -15127,18 +15127,7 @@
         <w:ind w:left="120" w:right="351"/>
       </w:pPr>
       <w:r>
-        <w:t xml:space="preserve">Shear strengths of greater than 80 </w:t>
-      </w:r>
-      <w:commentRangeStart w:id="7"/>
-      <w:r>
-        <w:t xml:space="preserve">psi</w:t>
-      </w:r>
-      <w:commentRangeEnd w:id="7"/>
-      <w:r>
-        <w:commentReference w:id="7"/>
-      </w:r>
-      <w:r>
-        <w:t xml:space="preserve"> were typically measured within this crust. The soils underlying the crust were observed to be significantly softer, with typical shear strengths of between 15-40 kPa. The thickness of the crust varies considerably across the site extent. In the northern and north-west regions of the site, the crust is anticipated to extend to a depth of 1.8 to 2.1m below existing ground surface. In the south-east region of the site, a thinner crust extending to depths of 0.6 to 1.2 m below existing ground</w:t>
+        <w:t xml:space="preserve">Shear strengths of greater than 80 psi were typically measured within this crust. The soils underlying the crust were observed to be significantly softer, with typical shear strengths of between 15-40 kPa. The thickness of the crust varies considerably across the site extent. In the northern and north-west regions of the site, the crust is anticipated to extend to a depth of 1.8 to 2.1m below existing ground surface. In the south-east region of the site, a thinner crust extending to depths of 0.6 to 1.2 m below existing ground</w:t>
       </w:r>
     </w:p>
     <w:p>
@@ -15223,7 +15212,7 @@
         <w:pStyle w:val="Heading2"/>
         <w:numPr>
           <w:ilvl w:val="1"/>
-          <w:numId w:val="5"/>
+          <w:numId w:val="3"/>
         </w:numPr>
         <w:tabs>
           <w:tab w:val="left" w:pos="684"/>
@@ -15240,7 +15229,7 @@
         <w:pStyle w:val="ListParagraph"/>
         <w:numPr>
           <w:ilvl w:val="2"/>
-          <w:numId w:val="5"/>
+          <w:numId w:val="3"/>
         </w:numPr>
         <w:tabs>
           <w:tab w:val="left" w:pos="1200"/>
@@ -15327,8 +15316,13 @@
         <w:t xml:space="preserve">It is likely that the soils at the foundation elevation will be prone to shrinkage and swelling when exposed to changes in </w:t>
       </w:r>
       <w:commentRangeStart w:id="8"/>
+      <w:commentRangeStart w:id="9"/>
       <w:r>
         <w:t xml:space="preserve">ftoisture</w:t>
+      </w:r>
+      <w:commentRangeEnd w:id="9"/>
+      <w:r>
+        <w:commentReference w:id="9"/>
       </w:r>
       <w:commentRangeEnd w:id="8"/>
       <w:r>
@@ -15349,7 +15343,7 @@
         <w:pStyle w:val="ListParagraph"/>
         <w:numPr>
           <w:ilvl w:val="2"/>
-          <w:numId w:val="5"/>
+          <w:numId w:val="3"/>
         </w:numPr>
         <w:tabs>
           <w:tab w:val="left" w:pos="1200"/>
@@ -15405,7 +15399,7 @@
         <w:pStyle w:val="ListParagraph"/>
         <w:numPr>
           <w:ilvl w:val="2"/>
-          <w:numId w:val="5"/>
+          <w:numId w:val="3"/>
         </w:numPr>
         <w:tabs>
           <w:tab w:val="left" w:pos="1200"/>
@@ -15450,13 +15444,13 @@
       <w:r>
         <w:t xml:space="preserve">trench excavations to a </w:t>
       </w:r>
-      <w:commentRangeStart w:id="9"/>
+      <w:commentRangeStart w:id="10"/>
       <w:r>
         <w:t xml:space="preserve">ftinimum</w:t>
       </w:r>
-      <w:commentRangeEnd w:id="9"/>
-      <w:r>
-        <w:commentReference w:id="9"/>
+      <w:commentRangeEnd w:id="10"/>
+      <w:r>
+        <w:commentReference w:id="10"/>
       </w:r>
       <w:r>
         <w:t xml:space="preserve"> of three times the excavation depth away from existing structures.</w:t>
@@ -15488,13 +15482,13 @@
         <w:spacing w:line="268" w:lineRule="exact"/>
         <w:ind w:left="120"/>
       </w:pPr>
-      <w:commentRangeStart w:id="10"/>
+      <w:commentRangeStart w:id="11"/>
       <w:r>
         <w:t xml:space="preserve">daftage</w:t>
       </w:r>
-      <w:commentRangeEnd w:id="10"/>
-      <w:r>
-        <w:commentReference w:id="10"/>
+      <w:commentRangeEnd w:id="11"/>
+      <w:r>
+        <w:commentReference w:id="11"/>
       </w:r>
       <w:r>
         <w:t xml:space="preserve"> to buildings and infrastructure.</w:t>
@@ -15565,7 +15559,7 @@
         <w:pStyle w:val="ListParagraph"/>
         <w:numPr>
           <w:ilvl w:val="2"/>
-          <w:numId w:val="5"/>
+          <w:numId w:val="3"/>
         </w:numPr>
         <w:tabs>
           <w:tab w:val="left" w:pos="1200"/>
@@ -15610,13 +15604,13 @@
       <w:r>
         <w:t xml:space="preserve">(</w:t>
       </w:r>
-      <w:commentRangeStart w:id="11"/>
+      <w:commentRangeStart w:id="12"/>
       <w:r>
         <w:t xml:space="preserve">Noveftber</w:t>
       </w:r>
-      <w:commentRangeEnd w:id="11"/>
-      <w:r>
-        <w:commentReference w:id="11"/>
+      <w:commentRangeEnd w:id="12"/>
+      <w:r>
+        <w:commentReference w:id="12"/>
       </w:r>
       <w:r>
         <w:t xml:space="preserve"> to April). Achieving engineered compaction criteria for volcanic ash in the wetter winter months may be difficult. If earthworks proceed outside of summer, lime stabilisation or other conditioning of the</w:t>
@@ -15709,7 +15703,7 @@
         <w:pStyle w:val="ListParagraph"/>
         <w:numPr>
           <w:ilvl w:val="2"/>
-          <w:numId w:val="5"/>
+          <w:numId w:val="3"/>
         </w:numPr>
         <w:tabs>
           <w:tab w:val="left" w:pos="1200"/>
@@ -16757,7 +16751,7 @@
         <w:pStyle w:val="Heading2"/>
         <w:numPr>
           <w:ilvl w:val="1"/>
-          <w:numId w:val="5"/>
+          <w:numId w:val="3"/>
         </w:numPr>
         <w:tabs>
           <w:tab w:val="left" w:pos="685"/>
@@ -16773,7 +16767,7 @@
         <w:pStyle w:val="ListParagraph"/>
         <w:numPr>
           <w:ilvl w:val="2"/>
-          <w:numId w:val="5"/>
+          <w:numId w:val="3"/>
         </w:numPr>
         <w:tabs>
           <w:tab w:val="left" w:pos="1200"/>
@@ -16828,13 +16822,13 @@
       <w:r>
         <w:t xml:space="preserve">On the basis of the available </w:t>
       </w:r>
-      <w:commentRangeStart w:id="12"/>
+      <w:commentRangeStart w:id="13"/>
       <w:r>
         <w:t xml:space="preserve">inforftation</w:t>
       </w:r>
-      <w:commentRangeEnd w:id="12"/>
-      <w:r>
-        <w:commentReference w:id="12"/>
+      <w:commentRangeEnd w:id="13"/>
+      <w:r>
+        <w:commentReference w:id="13"/>
       </w:r>
       <w:r>
         <w:t xml:space="preserve">, shallow or piled foundation are likely to be suitable options to</w:t>
@@ -16871,7 +16865,7 @@
         <w:pStyle w:val="ListParagraph"/>
         <w:numPr>
           <w:ilvl w:val="3"/>
-          <w:numId w:val="5"/>
+          <w:numId w:val="3"/>
         </w:numPr>
         <w:tabs>
           <w:tab w:val="left" w:pos="1197"/>
@@ -17714,18 +17708,7 @@
         </w:rPr>
       </w:pPr>
       <w:r>
-        <w:t xml:space="preserve">NOTE 1: The foundation subgrade should have an undrained shear strength of not less than 80 </w:t>
-      </w:r>
-      <w:commentRangeStart w:id="13"/>
-      <w:r>
-        <w:t xml:space="preserve">psi</w:t>
-      </w:r>
-      <w:commentRangeEnd w:id="13"/>
-      <w:r>
-        <w:commentReference w:id="13"/>
-      </w:r>
-      <w:r>
-        <w:t xml:space="preserve"> to at least 1 ft beneath the base of the footing (based on a review of the nearest boreholes by a Chartered Professional Geotechnical Engineer). This can comprise the natural crust or engineered fill.</w:t>
+        <w:t xml:space="preserve">NOTE 1: The foundation subgrade should have an undrained shear strength of not less than 80 psi to at least 1 ft beneath the base of the footing (based on a review of the nearest boreholes by a Chartered Professional Geotechnical Engineer). This can comprise the natural crust or engineered fill.</w:t>
       </w:r>
     </w:p>
     <w:p>
@@ -17738,18 +17721,7 @@
         </w:rPr>
       </w:pPr>
       <w:r>
-        <w:t xml:space="preserve">NOTE 2: Where the soil within 1 m of the underside of the foundations has an undrained shear strength of less than 80 </w:t>
-      </w:r>
-      <w:commentRangeStart w:id="14"/>
-      <w:r>
-        <w:t xml:space="preserve">psi</w:t>
-      </w:r>
-      <w:commentRangeEnd w:id="14"/>
-      <w:r>
-        <w:commentReference w:id="14"/>
-      </w:r>
-      <w:r>
-        <w:t xml:space="preserve"> (based on a review of the nearest boreholes).</w:t>
+        <w:t xml:space="preserve">NOTE 2: Where the soil within 1 m of the underside of the foundations has an undrained shear strength of less than 80 psi (based on a review of the nearest boreholes).</w:t>
       </w:r>
     </w:p>
     <w:p>
@@ -17767,7 +17739,7 @@
         <w:pStyle w:val="ListParagraph"/>
         <w:numPr>
           <w:ilvl w:val="3"/>
-          <w:numId w:val="5"/>
+          <w:numId w:val="3"/>
         </w:numPr>
         <w:tabs>
           <w:tab w:val="left" w:pos="1197"/>
@@ -17818,18 +17790,7 @@
         <w:ind w:left="120"/>
       </w:pPr>
       <w:r>
-        <w:t xml:space="preserve">pressures of 10-30 </w:t>
-      </w:r>
-      <w:commentRangeStart w:id="15"/>
-      <w:r>
-        <w:t xml:space="preserve">psi</w:t>
-      </w:r>
-      <w:commentRangeEnd w:id="15"/>
-      <w:r>
-        <w:commentReference w:id="15"/>
-      </w:r>
-      <w:r>
-        <w:t xml:space="preserve">, to simulate the weight of light weight 1-3 storey buildings. The assessment has been</w:t>
+        <w:t xml:space="preserve">pressures of 10-30 psi, to simulate the weight of light weight 1-3 storey buildings. The assessment has been</w:t>
       </w:r>
     </w:p>
     <w:p>
@@ -19099,18 +19060,7 @@
         <w:ind w:left="120"/>
       </w:pPr>
       <w:r>
-        <w:t xml:space="preserve">Where buildings are limited to 1-2 storeys (i.e. with serviceability limit state loads of up to 20 </w:t>
-      </w:r>
-      <w:commentRangeStart w:id="16"/>
-      <w:r>
-        <w:t xml:space="preserve">psi</w:t>
-      </w:r>
-      <w:commentRangeEnd w:id="16"/>
-      <w:r>
-        <w:commentReference w:id="16"/>
-      </w:r>
-      <w:r>
-        <w:t xml:space="preserve">) on</w:t>
+        <w:t xml:space="preserve">Where buildings are limited to 1-2 storeys (i.e. with serviceability limit state loads of up to 20 psi) on</w:t>
       </w:r>
     </w:p>
     <w:p>
@@ -19140,13 +19090,13 @@
       <w:r>
         <w:t xml:space="preserve">joints should be used to </w:t>
       </w:r>
-      <w:commentRangeStart w:id="17"/>
+      <w:commentRangeStart w:id="14"/>
       <w:r>
         <w:t xml:space="preserve">ftitigate</w:t>
       </w:r>
-      <w:commentRangeEnd w:id="17"/>
-      <w:r>
-        <w:commentReference w:id="17"/>
+      <w:commentRangeEnd w:id="14"/>
+      <w:r>
+        <w:commentReference w:id="14"/>
       </w:r>
       <w:r>
         <w:t xml:space="preserve"> the effects of differential foundation settlement. For example, movement joints between adjoining terrace houses may be necessary to mitigate against differential settlement risks.</w:t>
@@ -19194,7 +19144,7 @@
         <w:pStyle w:val="ListParagraph"/>
         <w:numPr>
           <w:ilvl w:val="2"/>
-          <w:numId w:val="5"/>
+          <w:numId w:val="3"/>
         </w:numPr>
         <w:tabs>
           <w:tab w:val="left" w:pos="1200"/>
@@ -19225,7 +19175,7 @@
         <w:pStyle w:val="ListParagraph"/>
         <w:numPr>
           <w:ilvl w:val="3"/>
-          <w:numId w:val="5"/>
+          <w:numId w:val="3"/>
         </w:numPr>
         <w:tabs>
           <w:tab w:val="left" w:pos="1197"/>
@@ -19285,7 +19235,7 @@
         <w:pStyle w:val="ListParagraph"/>
         <w:numPr>
           <w:ilvl w:val="0"/>
-          <w:numId w:val="7"/>
+          <w:numId w:val="5"/>
         </w:numPr>
         <w:tabs>
           <w:tab w:val="left" w:pos="476"/>
@@ -19302,7 +19252,7 @@
         <w:pStyle w:val="ListParagraph"/>
         <w:numPr>
           <w:ilvl w:val="0"/>
-          <w:numId w:val="7"/>
+          <w:numId w:val="5"/>
         </w:numPr>
         <w:tabs>
           <w:tab w:val="left" w:pos="477"/>
@@ -19319,7 +19269,7 @@
         <w:pStyle w:val="ListParagraph"/>
         <w:numPr>
           <w:ilvl w:val="0"/>
-          <w:numId w:val="7"/>
+          <w:numId w:val="5"/>
         </w:numPr>
         <w:tabs>
           <w:tab w:val="left" w:pos="477"/>
@@ -19336,7 +19286,7 @@
         <w:pStyle w:val="ListParagraph"/>
         <w:numPr>
           <w:ilvl w:val="0"/>
-          <w:numId w:val="7"/>
+          <w:numId w:val="5"/>
         </w:numPr>
         <w:tabs>
           <w:tab w:val="left" w:pos="477"/>
@@ -19379,7 +19329,7 @@
         <w:pStyle w:val="ListParagraph"/>
         <w:numPr>
           <w:ilvl w:val="3"/>
-          <w:numId w:val="5"/>
+          <w:numId w:val="3"/>
         </w:numPr>
         <w:tabs>
           <w:tab w:val="left" w:pos="1197"/>
@@ -19445,7 +19395,7 @@
         <w:pStyle w:val="ListParagraph"/>
         <w:numPr>
           <w:ilvl w:val="3"/>
-          <w:numId w:val="5"/>
+          <w:numId w:val="3"/>
         </w:numPr>
         <w:tabs>
           <w:tab w:val="left" w:pos="1197"/>
@@ -19496,7 +19446,7 @@
         <w:pStyle w:val="ListParagraph"/>
         <w:numPr>
           <w:ilvl w:val="4"/>
-          <w:numId w:val="5"/>
+          <w:numId w:val="3"/>
         </w:numPr>
         <w:tabs>
           <w:tab w:val="left" w:pos="480"/>
@@ -19513,7 +19463,7 @@
         <w:pStyle w:val="ListParagraph"/>
         <w:numPr>
           <w:ilvl w:val="4"/>
-          <w:numId w:val="5"/>
+          <w:numId w:val="3"/>
         </w:numPr>
         <w:tabs>
           <w:tab w:val="left" w:pos="480"/>
@@ -19581,7 +19531,7 @@
         <w:pStyle w:val="ListParagraph"/>
         <w:numPr>
           <w:ilvl w:val="4"/>
-          <w:numId w:val="5"/>
+          <w:numId w:val="3"/>
         </w:numPr>
         <w:tabs>
           <w:tab w:val="left" w:pos="480"/>
@@ -19614,7 +19564,7 @@
         <w:pStyle w:val="ListParagraph"/>
         <w:numPr>
           <w:ilvl w:val="3"/>
-          <w:numId w:val="5"/>
+          <w:numId w:val="3"/>
         </w:numPr>
         <w:tabs>
           <w:tab w:val="left" w:pos="1197"/>
@@ -19681,7 +19631,7 @@
         <w:pStyle w:val="ListParagraph"/>
         <w:numPr>
           <w:ilvl w:val="3"/>
-          <w:numId w:val="5"/>
+          <w:numId w:val="3"/>
         </w:numPr>
         <w:tabs>
           <w:tab w:val="left" w:pos="1197"/>
@@ -19982,7 +19932,7 @@
         <w:pStyle w:val="ListParagraph"/>
         <w:numPr>
           <w:ilvl w:val="2"/>
-          <w:numId w:val="5"/>
+          <w:numId w:val="3"/>
         </w:numPr>
         <w:tabs>
           <w:tab w:val="left" w:pos="1200"/>
@@ -20841,7 +20791,7 @@
         <w:pStyle w:val="ListParagraph"/>
         <w:numPr>
           <w:ilvl w:val="2"/>
-          <w:numId w:val="5"/>
+          <w:numId w:val="3"/>
         </w:numPr>
         <w:tabs>
           <w:tab w:val="left" w:pos="840"/>
@@ -20883,18 +20833,7 @@
         <w:ind w:left="120"/>
       </w:pPr>
       <w:r>
-        <w:t xml:space="preserve">approximately 500 to 700 </w:t>
-      </w:r>
-      <w:commentRangeStart w:id="18"/>
-      <w:r>
-        <w:t xml:space="preserve">kN</w:t>
-      </w:r>
-      <w:commentRangeEnd w:id="18"/>
-      <w:r>
-        <w:commentReference w:id="18"/>
-      </w:r>
-      <w:r>
-        <w:t xml:space="preserve"> (i.e. ULS capacity of 250 to 350 kN). Piles should be located at least 900 mm apart, or analysed for pile group effects. Alternative piling options should be assessed by a Chartered</w:t>
+        <w:t xml:space="preserve">approximately 500 to 700 kN (i.e. ULS capacity of 250 to 350 kN). Piles should be located at least 900 mm apart, or analysed for pile group effects. Alternative piling options should be assessed by a Chartered</w:t>
       </w:r>
     </w:p>
     <w:p>
@@ -20916,13 +20855,13 @@
       <w:r>
         <w:t xml:space="preserve">If loads are applied to the ground surface (e.g. </w:t>
       </w:r>
-      <w:commentRangeStart w:id="19"/>
+      <w:commentRangeStart w:id="15"/>
       <w:r>
         <w:t xml:space="preserve">placeftent</w:t>
       </w:r>
-      <w:commentRangeEnd w:id="19"/>
-      <w:r>
-        <w:commentReference w:id="19"/>
+      <w:commentRangeEnd w:id="15"/>
+      <w:r>
+        <w:commentReference w:id="15"/>
       </w:r>
       <w:r>
         <w:t xml:space="preserve"> of fill or structures on shallow foundations),</w:t>
@@ -20949,7 +20888,7 @@
         <w:pStyle w:val="Heading2"/>
         <w:numPr>
           <w:ilvl w:val="1"/>
-          <w:numId w:val="5"/>
+          <w:numId w:val="3"/>
         </w:numPr>
         <w:tabs>
           <w:tab w:val="left" w:pos="684"/>
@@ -21009,13 +20948,13 @@
       <w:r>
         <w:t xml:space="preserve">Table 8: Retention design </w:t>
       </w:r>
-      <w:commentRangeStart w:id="20"/>
+      <w:commentRangeStart w:id="16"/>
       <w:r>
         <w:t xml:space="preserve">parafteters</w:t>
       </w:r>
-      <w:commentRangeEnd w:id="20"/>
-      <w:r>
-        <w:commentReference w:id="20"/>
+      <w:commentRangeEnd w:id="16"/>
+      <w:r>
+        <w:commentReference w:id="16"/>
       </w:r>
     </w:p>
     <w:p>
@@ -21989,7 +21928,7 @@
               <w:pStyle w:val="TableParagraph"/>
               <w:numPr>
                 <w:ilvl w:val="0"/>
-                <w:numId w:val="8"/>
+                <w:numId w:val="6"/>
               </w:numPr>
               <w:tabs>
                 <w:tab w:val="left" w:pos="425"/>
@@ -22389,7 +22328,7 @@
               <w:pStyle w:val="TableParagraph"/>
               <w:numPr>
                 <w:ilvl w:val="0"/>
-                <w:numId w:val="8"/>
+                <w:numId w:val="6"/>
               </w:numPr>
               <w:tabs>
                 <w:tab w:val="left" w:pos="425"/>
@@ -22883,7 +22822,7 @@
               <w:pStyle w:val="TableParagraph"/>
               <w:numPr>
                 <w:ilvl w:val="0"/>
-                <w:numId w:val="8"/>
+                <w:numId w:val="6"/>
               </w:numPr>
               <w:tabs>
                 <w:tab w:val="left" w:pos="425"/>
@@ -23114,7 +23053,7 @@
               <w:pStyle w:val="TableParagraph"/>
               <w:numPr>
                 <w:ilvl w:val="0"/>
-                <w:numId w:val="8"/>
+                <w:numId w:val="6"/>
               </w:numPr>
               <w:tabs>
                 <w:tab w:val="left" w:pos="425"/>
@@ -23385,13 +23324,13 @@
         <w:spacing w:before="1" w:line="264" w:lineRule="auto"/>
         <w:ind w:left="120"/>
       </w:pPr>
-      <w:commentRangeStart w:id="21"/>
+      <w:commentRangeStart w:id="17"/>
       <w:r>
         <w:t xml:space="preserve">Assufting</w:t>
       </w:r>
-      <w:commentRangeEnd w:id="21"/>
-      <w:r>
-        <w:commentReference w:id="21"/>
+      <w:commentRangeEnd w:id="17"/>
+      <w:r>
+        <w:commentReference w:id="17"/>
       </w:r>
       <w:r>
         <w:t xml:space="preserve"> a 45° zone of influence and a horizontal backslope, the minimum safe horizontal offset (x) may be calculated as:</w:t>
@@ -23441,7 +23380,7 @@
         <w:pStyle w:val="Heading2"/>
         <w:numPr>
           <w:ilvl w:val="1"/>
-          <w:numId w:val="5"/>
+          <w:numId w:val="3"/>
         </w:numPr>
         <w:tabs>
           <w:tab w:val="left" w:pos="685"/>
@@ -23522,7 +23461,7 @@
         <w:pStyle w:val="Heading2"/>
         <w:numPr>
           <w:ilvl w:val="1"/>
-          <w:numId w:val="5"/>
+          <w:numId w:val="3"/>
         </w:numPr>
         <w:tabs>
           <w:tab w:val="left" w:pos="685"/>
@@ -23539,7 +23478,7 @@
         <w:pStyle w:val="ListParagraph"/>
         <w:numPr>
           <w:ilvl w:val="2"/>
-          <w:numId w:val="5"/>
+          <w:numId w:val="3"/>
         </w:numPr>
         <w:tabs>
           <w:tab w:val="left" w:pos="1200"/>
@@ -23586,7 +23525,7 @@
         <w:pStyle w:val="ListParagraph"/>
         <w:numPr>
           <w:ilvl w:val="2"/>
-          <w:numId w:val="5"/>
+          <w:numId w:val="3"/>
         </w:numPr>
         <w:tabs>
           <w:tab w:val="left" w:pos="1200"/>
@@ -23642,7 +23581,7 @@
         <w:pStyle w:val="ListParagraph"/>
         <w:numPr>
           <w:ilvl w:val="2"/>
-          <w:numId w:val="5"/>
+          <w:numId w:val="3"/>
         </w:numPr>
         <w:tabs>
           <w:tab w:val="left" w:pos="1200"/>
@@ -23686,13 +23625,13 @@
       <w:r>
         <w:t xml:space="preserve">Based on our </w:t>
       </w:r>
-      <w:commentRangeStart w:id="22"/>
+      <w:commentRangeStart w:id="18"/>
       <w:r>
         <w:t xml:space="preserve">preliftinary</w:t>
       </w:r>
-      <w:commentRangeEnd w:id="22"/>
-      <w:r>
-        <w:commentReference w:id="22"/>
+      <w:commentRangeEnd w:id="18"/>
+      <w:r>
+        <w:commentReference w:id="18"/>
       </w:r>
       <w:r>
         <w:t xml:space="preserve"> assessment, the site is considered to have a low susceptibility of cyclic softening. This low susceptibility to cyclic softening and the distance to the nearest open face (for lateral spread to occur) from the subject site results in a low risk of lateral spread or instability as a result of cyclic softening.</w:t>
@@ -23709,7 +23648,7 @@
         <w:pStyle w:val="Heading2"/>
         <w:numPr>
           <w:ilvl w:val="1"/>
-          <w:numId w:val="5"/>
+          <w:numId w:val="3"/>
         </w:numPr>
         <w:tabs>
           <w:tab w:val="left" w:pos="685"/>
@@ -23749,13 +23688,13 @@
       <w:r>
         <w:t xml:space="preserve">Chartered Geotechnical Engineer. Depending on the building </w:t>
       </w:r>
-      <w:commentRangeStart w:id="23"/>
+      <w:commentRangeStart w:id="19"/>
       <w:r>
         <w:t xml:space="preserve">forft</w:t>
       </w:r>
-      <w:commentRangeEnd w:id="23"/>
-      <w:r>
-        <w:commentReference w:id="23"/>
+      <w:commentRangeEnd w:id="19"/>
+      <w:r>
+        <w:commentReference w:id="19"/>
       </w:r>
       <w:r>
         <w:t xml:space="preserve">, it may be necessary to carry out</w:t>
@@ -23894,171 +23833,143 @@
 
 <file path=word/comments.xml><?xml version="1.0" encoding="utf-8"?>
 <w:comments xmlns:wpc="http://schemas.microsoft.com/office/word/2010/wordprocessingCanvas" xmlns:cx="http://schemas.microsoft.com/office/drawing/2014/chartex" xmlns:cx1="http://schemas.microsoft.com/office/drawing/2015/9/8/chartex" xmlns:cx2="http://schemas.microsoft.com/office/drawing/2015/10/21/chartex" xmlns:cx3="http://schemas.microsoft.com/office/drawing/2016/5/9/chartex" xmlns:cx4="http://schemas.microsoft.com/office/drawing/2016/5/10/chartex" xmlns:cx5="http://schemas.microsoft.com/office/drawing/2016/5/11/chartex" xmlns:mc="http://schemas.openxmlformats.org/markup-compatibility/2006" xmlns:o="urn:schemas-microsoft-com:office:office" xmlns:r="http://schemas.openxmlformats.org/officeDocument/2006/relationships" xmlns:m="http://schemas.openxmlformats.org/officeDocument/2006/math" xmlns:v="urn:schemas-microsoft-com:vml" xmlns:wp14="http://schemas.microsoft.com/office/word/2010/wordprocessingDrawing" xmlns:wp="http://schemas.openxmlformats.org/drawingml/2006/wordprocessingDrawing" xmlns:w10="urn:schemas-microsoft-com:office:word" xmlns:w="http://schemas.openxmlformats.org/wordprocessingml/2006/main" xmlns:w14="http://schemas.microsoft.com/office/word/2010/wordml" xmlns:w15="http://schemas.microsoft.com/office/word/2012/wordml" xmlns:wne="http://schemas.microsoft.com/office/word/2006/wordml" xmlns:wpg="http://schemas.microsoft.com/office/word/2010/wordprocessingGroup" xmlns:wpi="http://schemas.microsoft.com/office/word/2010/wordprocessingInk" xmlns:wps="http://schemas.microsoft.com/office/word/2010/wordprocessingShape" mc:Ignorable="w14 w15 wp14">
-  <w:comment w:id="0" w:author=" [MAJOR] Grammar and Spelling Check" w:date="2025-05-26T20:43:46Z" w:initials="AI">
-    <w:p>
-      <w:r>
-        <w:t xml:space="preserve">Correct the spelling error: "inforft" should be "inform".</w:t>
+  <w:comment w:id="0" w:author=" [MAJOR] Grammar and Spelling Check" w:date="2025-05-27T03:03:45Z" w:initials="AI">
+    <w:p>
+      <w:r>
+        <w:t xml:space="preserve">The sentence 'ClientCorp Ltd will also provide this report to build partners to inforft them in assessing the suitability of the land for buildings.' is grammatically incorrect. Consider rephrasing for clarity, such as: 'ClientCorp Ltd will also provide this report to building partners to inform them about assessing the suitability of the land for buildings.'</w:t>
       </w:r>
     </w:p>
   </w:comment>
-  <w:comment w:id="1" w:author=" [MAJOR] Grammar and Spelling Check" w:date="2025-05-26T20:43:46Z" w:initials="AI">
-    <w:p>
-      <w:r>
-        <w:t xml:space="preserve">Correct the spelling error: "reftediation" should be "remediation".</w:t>
+  <w:comment w:id="1" w:author=" [MAJOR] Grammar and Spelling Check" w:date="2025-05-27T03:03:45Z" w:initials="AI">
+    <w:p>
+      <w:r>
+        <w:t xml:space="preserve">Correct the spelling error from 'inforft' to 'inform'.</w:t>
       </w:r>
     </w:p>
   </w:comment>
-  <w:comment w:id="2" w:author=" [MAJOR] Grammar and Spelling Check" w:date="2025-05-26T20:43:46Z" w:initials="AI">
-    <w:p>
-      <w:r>
-        <w:t xml:space="preserve">Correct the spelling error: "developftent" should be "development".</w:t>
+  <w:comment w:id="2" w:author=" [MAJOR] Grammar and Spelling Check" w:date="2025-05-27T03:03:45Z" w:initials="AI">
+    <w:p>
+      <w:r>
+        <w:t xml:space="preserve">Correct the spelling error from 'reftediation' to 'remediation'.</w:t>
       </w:r>
     </w:p>
   </w:comment>
-  <w:comment w:id="3" w:author=" [MAJOR] Grammar and Spelling Check" w:date="2025-05-26T20:43:46Z" w:initials="AI">
-    <w:p>
-      <w:r>
-        <w:t xml:space="preserve">Correct the spelling error: "iftmediate" should be "immediate".</w:t>
+  <w:comment w:id="3" w:author=" [MAJOR] Grammar and Spelling Check" w:date="2025-05-27T03:03:45Z" w:initials="AI">
+    <w:p>
+      <w:r>
+        <w:t xml:space="preserve">The phrase 'Land Remediation Investigation Report: Land Remediation Investigation Report:' is repeated. Remove the redundant repetition.</w:t>
       </w:r>
     </w:p>
   </w:comment>
-  <w:comment w:id="4" w:author=" [MINOR] Units and Symbols Consistency" w:date="2025-05-26T20:43:51Z" w:initials="AI">
-    <w:p>
-      <w:r>
-        <w:t xml:space="preserve">Inconsistent unit, should be kPa</w:t>
+  <w:comment w:id="4" w:author=" [MAJOR] Grammar and Spelling Check" w:date="2025-05-27T03:03:45Z" w:initials="AI">
+    <w:p>
+      <w:r>
+        <w:t xml:space="preserve">Correct the spelling error from 'developftent' to 'development'.</w:t>
       </w:r>
     </w:p>
   </w:comment>
-  <w:comment w:id="5" w:author=" [MAJOR] Grammar and Spelling Check" w:date="2025-05-26T20:43:46Z" w:initials="AI">
-    <w:p>
-      <w:r>
-        <w:t xml:space="preserve">Correct the spelling error: "Coftpressible" should be "Compressible".</w:t>
+  <w:comment w:id="5" w:author=" [MAJOR] Grammar and Spelling Check" w:date="2025-05-27T03:03:45Z" w:initials="AI">
+    <w:p>
+      <w:r>
+        <w:t xml:space="preserve">Correct the spelling error from 'iftmediate' to 'immediate'.</w:t>
       </w:r>
     </w:p>
   </w:comment>
-  <w:comment w:id="6" w:author=" [MAJOR] Grammar and Spelling Check" w:date="2025-05-26T20:43:46Z" w:initials="AI">
-    <w:p>
-      <w:r>
-        <w:t xml:space="preserve">Correct the spelling error: "paveftents" should be "pavements".</w:t>
+  <w:comment w:id="6" w:author=" [MAJOR] Grammar and Spelling Check" w:date="2025-05-27T03:03:45Z" w:initials="AI">
+    <w:p>
+      <w:r>
+        <w:t xml:space="preserve">Correct the spelling error from 'Coftpressible' to 'Compressible'.</w:t>
       </w:r>
     </w:p>
   </w:comment>
-  <w:comment w:id="7" w:author=" [MINOR] Units and Symbols Consistency" w:date="2025-05-26T20:43:51Z" w:initials="AI">
-    <w:p>
-      <w:r>
-        <w:t xml:space="preserve">Inconsistent unit, should be kPa</w:t>
+  <w:comment w:id="7" w:author=" [MAJOR] Grammar and Spelling Check" w:date="2025-05-27T03:03:45Z" w:initials="AI">
+    <w:p>
+      <w:r>
+        <w:t xml:space="preserve">Correct the spelling error from 'paveftents' to 'pavements'.</w:t>
       </w:r>
     </w:p>
   </w:comment>
-  <w:comment w:id="8" w:author=" [MAJOR] Grammar and Spelling Check" w:date="2025-05-26T20:43:46Z" w:initials="AI">
-    <w:p>
-      <w:r>
-        <w:t xml:space="preserve">Correct the spelling error: "ftoisture" should be "moisture".</w:t>
+  <w:comment w:id="9" w:author=" [MAJOR] Grammar and Spelling Check" w:date="2025-05-27T03:03:45Z" w:initials="AI">
+    <w:p>
+      <w:r>
+        <w:t xml:space="preserve">In the sentence 'It is likely that the soils at the foundation elevation will be prone to shrinkage and swelling when exposed to changes in ftoisture content.', 'ftoisture' should be 'moisture'.</w:t>
       </w:r>
     </w:p>
   </w:comment>
-  <w:comment w:id="9" w:author=" [MAJOR] Grammar and Spelling Check" w:date="2025-05-26T20:43:46Z" w:initials="AI">
-    <w:p>
-      <w:r>
-        <w:t xml:space="preserve">Correct the spelling error: "ftinimum" should be "minimum".</w:t>
+  <w:comment w:id="8" w:author=" [MAJOR] Grammar and Spelling Check" w:date="2025-05-27T03:03:45Z" w:initials="AI">
+    <w:p>
+      <w:r>
+        <w:t xml:space="preserve">Correct the spelling error from 'ftoisture' to 'moisture'.</w:t>
       </w:r>
     </w:p>
   </w:comment>
-  <w:comment w:id="10" w:author=" [MAJOR] Grammar and Spelling Check" w:date="2025-05-26T20:43:46Z" w:initials="AI">
-    <w:p>
-      <w:r>
-        <w:t xml:space="preserve">Correct the spelling error: "daftage" should be "damage".</w:t>
+  <w:comment w:id="10" w:author=" [MAJOR] Grammar and Spelling Check" w:date="2025-05-27T03:03:45Z" w:initials="AI">
+    <w:p>
+      <w:r>
+        <w:t xml:space="preserve">Correct the spelling error from 'ftinimum' to 'minimum'.</w:t>
       </w:r>
     </w:p>
   </w:comment>
-  <w:comment w:id="11" w:author=" [MAJOR] Grammar and Spelling Check" w:date="2025-05-26T20:43:46Z" w:initials="AI">
-    <w:p>
-      <w:r>
-        <w:t xml:space="preserve">Correct the spelling error: "Noveftber" should be "November".</w:t>
+  <w:comment w:id="11" w:author=" [MAJOR] Grammar and Spelling Check" w:date="2025-05-27T03:03:45Z" w:initials="AI">
+    <w:p>
+      <w:r>
+        <w:t xml:space="preserve">Correct the spelling error from 'daftage' to 'damage'.</w:t>
       </w:r>
     </w:p>
   </w:comment>
-  <w:comment w:id="12" w:author=" [MAJOR] Grammar and Spelling Check" w:date="2025-05-26T20:43:46Z" w:initials="AI">
-    <w:p>
-      <w:r>
-        <w:t xml:space="preserve">Correct the spelling error: "inforftation" should be "information".</w:t>
+  <w:comment w:id="12" w:author=" [MAJOR] Grammar and Spelling Check" w:date="2025-05-27T03:03:45Z" w:initials="AI">
+    <w:p>
+      <w:r>
+        <w:t xml:space="preserve">Correct the spelling error from 'Noveftber' to 'November'.</w:t>
       </w:r>
     </w:p>
   </w:comment>
-  <w:comment w:id="13" w:author=" [MINOR] Units and Symbols Consistency" w:date="2025-05-26T20:43:51Z" w:initials="AI">
-    <w:p>
-      <w:r>
-        <w:t xml:space="preserve">Inconsistent unit, should be kPa</w:t>
+  <w:comment w:id="13" w:author=" [MAJOR] Grammar and Spelling Check" w:date="2025-05-27T03:03:45Z" w:initials="AI">
+    <w:p>
+      <w:r>
+        <w:t xml:space="preserve">Correct the spelling error from 'inforftation' to 'information'.</w:t>
       </w:r>
     </w:p>
   </w:comment>
-  <w:comment w:id="14" w:author=" [MINOR] Units and Symbols Consistency" w:date="2025-05-26T20:43:51Z" w:initials="AI">
-    <w:p>
-      <w:r>
-        <w:t xml:space="preserve">Inconsistent unit, should be kPa</w:t>
+  <w:comment w:id="14" w:author=" [MAJOR] Grammar and Spelling Check" w:date="2025-05-27T03:03:45Z" w:initials="AI">
+    <w:p>
+      <w:r>
+        <w:t xml:space="preserve">In the sentence 'For structures of greater than 20m length constructed on variable ground we recommend construction joints should be used to ftitigate the effects of differential foundation settlement.', 'ftitigate' should be 'mitigate'.</w:t>
       </w:r>
     </w:p>
   </w:comment>
-  <w:comment w:id="15" w:author=" [MINOR] Units and Symbols Consistency" w:date="2025-05-26T20:43:51Z" w:initials="AI">
-    <w:p>
-      <w:r>
-        <w:t xml:space="preserve">Inconsistent unit, should be kPa</w:t>
+  <w:comment w:id="15" w:author=" [MAJOR] Grammar and Spelling Check" w:date="2025-05-27T03:03:45Z" w:initials="AI">
+    <w:p>
+      <w:r>
+        <w:t xml:space="preserve">Correct the spelling error from 'placeftent' to 'placement'.</w:t>
       </w:r>
     </w:p>
   </w:comment>
-  <w:comment w:id="16" w:author=" [MINOR] Units and Symbols Consistency" w:date="2025-05-26T20:43:51Z" w:initials="AI">
-    <w:p>
-      <w:r>
-        <w:t xml:space="preserve">Inconsistent unit, should be kPa</w:t>
+  <w:comment w:id="16" w:author=" [MAJOR] Grammar and Spelling Check" w:date="2025-05-27T03:03:45Z" w:initials="AI">
+    <w:p>
+      <w:r>
+        <w:t xml:space="preserve">Correct the spelling error from 'parafteters' to 'parameters'.</w:t>
       </w:r>
     </w:p>
   </w:comment>
-  <w:comment w:id="17" w:author=" [MAJOR] Grammar and Spelling Check" w:date="2025-05-26T20:43:46Z" w:initials="AI">
-    <w:p>
-      <w:r>
-        <w:t xml:space="preserve">Correct the spelling error: "ftitigate" should be "mitigate".</w:t>
+  <w:comment w:id="17" w:author=" [MAJOR] Grammar and Spelling Check" w:date="2025-05-27T03:03:45Z" w:initials="AI">
+    <w:p>
+      <w:r>
+        <w:t xml:space="preserve">Correct the spelling error from 'Assufting' to 'Assuming'.</w:t>
       </w:r>
     </w:p>
   </w:comment>
-  <w:comment w:id="18" w:author=" [MINOR] Units and Symbols Consistency" w:date="2025-05-26T20:43:51Z" w:initials="AI">
-    <w:p>
-      <w:r>
-        <w:t xml:space="preserve">Inconsistent unit, should be kPa</w:t>
+  <w:comment w:id="18" w:author=" [MAJOR] Grammar and Spelling Check" w:date="2025-05-27T03:03:45Z" w:initials="AI">
+    <w:p>
+      <w:r>
+        <w:t xml:space="preserve">Correct the spelling error from 'preliftinary' to 'preliminary'.</w:t>
       </w:r>
     </w:p>
   </w:comment>
-  <w:comment w:id="19" w:author=" [MAJOR] Grammar and Spelling Check" w:date="2025-05-26T20:43:46Z" w:initials="AI">
-    <w:p>
-      <w:r>
-        <w:t xml:space="preserve">Correct the spelling error: "placeftent" should be "placement".</w:t>
-      </w:r>
-    </w:p>
-  </w:comment>
-  <w:comment w:id="20" w:author=" [MAJOR] Grammar and Spelling Check" w:date="2025-05-26T20:43:46Z" w:initials="AI">
-    <w:p>
-      <w:r>
-        <w:t xml:space="preserve">Correct the spelling error: "parafteters" should be "parameters".</w:t>
-      </w:r>
-    </w:p>
-  </w:comment>
-  <w:comment w:id="21" w:author=" [MAJOR] Grammar and Spelling Check" w:date="2025-05-26T20:43:46Z" w:initials="AI">
-    <w:p>
-      <w:r>
-        <w:t xml:space="preserve">Correct the spelling error: "Assufting" should be "Assuming".</w:t>
-      </w:r>
-    </w:p>
-  </w:comment>
-  <w:comment w:id="22" w:author=" [MAJOR] Grammar and Spelling Check" w:date="2025-05-26T20:43:46Z" w:initials="AI">
-    <w:p>
-      <w:r>
-        <w:t xml:space="preserve">Correct the spelling error: "preliftinary" should be "preliminary".</w:t>
-      </w:r>
-    </w:p>
-  </w:comment>
-  <w:comment w:id="23" w:author=" [MAJOR] Grammar and Spelling Check" w:date="2025-05-26T20:43:46Z" w:initials="AI">
-    <w:p>
-      <w:r>
-        <w:t xml:space="preserve">Correct the spelling error: "forft" should be "form".</w:t>
+  <w:comment w:id="19" w:author=" [MAJOR] Grammar and Spelling Check" w:date="2025-05-27T03:03:45Z" w:initials="AI">
+    <w:p>
+      <w:r>
+        <w:t xml:space="preserve">Correct the spelling error from 'forft' to 'form'.</w:t>
       </w:r>
     </w:p>
   </w:comment>
@@ -24067,30 +23978,26 @@
 
 <file path=word/commentsExtended.xml><?xml version="1.0" encoding="utf-8"?>
 <w15:commentsEx xmlns:wpc="http://schemas.microsoft.com/office/word/2010/wordprocessingCanvas" xmlns:cx="http://schemas.microsoft.com/office/drawing/2014/chartex" xmlns:cx1="http://schemas.microsoft.com/office/drawing/2015/9/8/chartex" xmlns:cx2="http://schemas.microsoft.com/office/drawing/2015/10/21/chartex" xmlns:cx3="http://schemas.microsoft.com/office/drawing/2016/5/9/chartex" xmlns:cx4="http://schemas.microsoft.com/office/drawing/2016/5/10/chartex" xmlns:cx5="http://schemas.microsoft.com/office/drawing/2016/5/11/chartex" xmlns:mc="http://schemas.openxmlformats.org/markup-compatibility/2006" xmlns:o="urn:schemas-microsoft-com:office:office" xmlns:r="http://schemas.openxmlformats.org/officeDocument/2006/relationships" xmlns:m="http://schemas.openxmlformats.org/officeDocument/2006/math" xmlns:v="urn:schemas-microsoft-com:vml" xmlns:wp14="http://schemas.microsoft.com/office/word/2010/wordprocessingDrawing" xmlns:wp="http://schemas.openxmlformats.org/drawingml/2006/wordprocessingDrawing" xmlns:w10="urn:schemas-microsoft-com:office:word" xmlns:w="http://schemas.openxmlformats.org/wordprocessingml/2006/main" xmlns:w14="http://schemas.microsoft.com/office/word/2010/wordml" xmlns:w15="http://schemas.microsoft.com/office/word/2012/wordml" xmlns:wne="http://schemas.microsoft.com/office/word/2006/wordml" xmlns:wpg="http://schemas.microsoft.com/office/word/2010/wordprocessingGroup" xmlns:wpi="http://schemas.microsoft.com/office/word/2010/wordprocessingInk" xmlns:wps="http://schemas.microsoft.com/office/word/2010/wordprocessingShape" mc:Ignorable="w14 w15 wp14">
-  <w15:commentEx w15:paraId="BA8EC7DE" w15:done="0"/>
-  <w15:commentEx w15:paraId="28F34ECB" w15:done="0"/>
-  <w15:commentEx w15:paraId="9BC5B133" w15:done="0"/>
-  <w15:commentEx w15:paraId="7492DA98" w15:done="0"/>
-  <w15:commentEx w15:paraId="F1F60645" w15:done="0"/>
-  <w15:commentEx w15:paraId="411608EB" w15:done="0"/>
-  <w15:commentEx w15:paraId="DF8731A2" w15:done="0"/>
-  <w15:commentEx w15:paraId="4CC869F1" w15:done="0"/>
-  <w15:commentEx w15:paraId="9C8E1060" w15:done="0"/>
-  <w15:commentEx w15:paraId="3762D544" w15:done="0"/>
-  <w15:commentEx w15:paraId="9E7773F0" w15:done="0"/>
-  <w15:commentEx w15:paraId="059BBB89" w15:done="0"/>
-  <w15:commentEx w15:paraId="F249A2A6" w15:done="0"/>
-  <w15:commentEx w15:paraId="B710B012" w15:done="0"/>
-  <w15:commentEx w15:paraId="A4B2FC77" w15:done="0"/>
-  <w15:commentEx w15:paraId="E1266675" w15:done="0"/>
-  <w15:commentEx w15:paraId="94D29542" w15:done="0"/>
-  <w15:commentEx w15:paraId="93C8413B" w15:done="0"/>
-  <w15:commentEx w15:paraId="504EDD6D" w15:done="0"/>
-  <w15:commentEx w15:paraId="C8B3008E" w15:done="0"/>
-  <w15:commentEx w15:paraId="02CE1F37" w15:done="0"/>
-  <w15:commentEx w15:paraId="0A856059" w15:done="0"/>
-  <w15:commentEx w15:paraId="216CA668" w15:done="0"/>
-  <w15:commentEx w15:paraId="1E1B217D" w15:done="0"/>
+  <w15:commentEx w15:paraId="90245FE0" w15:done="0"/>
+  <w15:commentEx w15:paraId="D80D0864" w15:done="0"/>
+  <w15:commentEx w15:paraId="34D4B5A3" w15:done="0"/>
+  <w15:commentEx w15:paraId="AE921B51" w15:done="0"/>
+  <w15:commentEx w15:paraId="2EEC380A" w15:done="0"/>
+  <w15:commentEx w15:paraId="18BC8DFC" w15:done="0"/>
+  <w15:commentEx w15:paraId="CA44B1D2" w15:done="0"/>
+  <w15:commentEx w15:paraId="C63C4514" w15:done="0"/>
+  <w15:commentEx w15:paraId="E6A7804C" w15:done="0"/>
+  <w15:commentEx w15:paraId="E5978711" w15:done="0"/>
+  <w15:commentEx w15:paraId="4DD96FBD" w15:done="0"/>
+  <w15:commentEx w15:paraId="C4B51A16" w15:done="0"/>
+  <w15:commentEx w15:paraId="2F80AF41" w15:done="0"/>
+  <w15:commentEx w15:paraId="61586FC0" w15:done="0"/>
+  <w15:commentEx w15:paraId="A9252AD8" w15:done="0"/>
+  <w15:commentEx w15:paraId="830F9479" w15:done="0"/>
+  <w15:commentEx w15:paraId="B09F2262" w15:done="0"/>
+  <w15:commentEx w15:paraId="7D6A65CF" w15:done="0"/>
+  <w15:commentEx w15:paraId="B0EBFA04" w15:done="0"/>
+  <w15:commentEx w15:paraId="99BCDA9F" w15:done="0"/>
 </w15:commentsEx>
 </file>
 
@@ -28097,244 +28004,8 @@
   <w:abstractNum w:abstractNumId="2">
     <w:nsid w:val="00000003"/>
     <w:multiLevelType w:val="multilevel"/>
-    <w:tmpl w:val="00000000"/>
-    <w:name w:val="Numbered_4e9f7d08-bf57-4222-b496-ac049dc173c2"/>
-    <w:lvl w:ilvl="0">
-      <w:start w:val="1"/>
-      <w:numFmt w:val="decimal"/>
-      <w:lvlText w:val="%1."/>
-      <w:lvlJc w:val="left"/>
-      <w:pPr>
-        <w:ind w:left="720" w:hanging="360"/>
-      </w:pPr>
-      <w:rPr>
-        <w:rFonts w:ascii="Times New Roman" w:eastAsia="Times New Roman" w:hAnsi="Times New Roman" w:cs="Times New Roman"/>
-      </w:rPr>
-    </w:lvl>
-    <w:lvl w:ilvl="1">
-      <w:start w:val="1"/>
-      <w:numFmt w:val="lowerLetter"/>
-      <w:lvlText w:val="%2."/>
-      <w:lvlJc w:val="right"/>
-      <w:pPr>
-        <w:ind w:left="1440" w:hanging="360"/>
-      </w:pPr>
-      <w:rPr>
-        <w:rFonts w:ascii="Times New Roman" w:eastAsia="Times New Roman" w:hAnsi="Times New Roman" w:cs="Times New Roman"/>
-      </w:rPr>
-    </w:lvl>
-    <w:lvl w:ilvl="2">
-      <w:start w:val="1"/>
-      <w:numFmt w:val="lowerRoman"/>
-      <w:lvlText w:val="%3."/>
-      <w:lvlJc w:val="left"/>
-      <w:pPr>
-        <w:ind w:left="2160" w:hanging="360"/>
-      </w:pPr>
-      <w:rPr>
-        <w:rFonts w:ascii="Times New Roman" w:eastAsia="Times New Roman" w:hAnsi="Times New Roman" w:cs="Times New Roman"/>
-      </w:rPr>
-    </w:lvl>
-    <w:lvl w:ilvl="3">
-      <w:start w:val="1"/>
-      <w:numFmt w:val="decimal"/>
-      <w:lvlText w:val="%4."/>
-      <w:lvlJc w:val="left"/>
-      <w:pPr>
-        <w:ind w:left="2880" w:hanging="360"/>
-      </w:pPr>
-      <w:rPr>
-        <w:rFonts w:ascii="Times New Roman" w:eastAsia="Times New Roman" w:hAnsi="Times New Roman" w:cs="Times New Roman"/>
-      </w:rPr>
-    </w:lvl>
-    <w:lvl w:ilvl="4">
-      <w:start w:val="1"/>
-      <w:numFmt w:val="lowerLetter"/>
-      <w:lvlText w:val="%5."/>
-      <w:lvlJc w:val="right"/>
-      <w:pPr>
-        <w:ind w:left="3600" w:hanging="360"/>
-      </w:pPr>
-      <w:rPr>
-        <w:rFonts w:ascii="Times New Roman" w:eastAsia="Times New Roman" w:hAnsi="Times New Roman" w:cs="Times New Roman"/>
-      </w:rPr>
-    </w:lvl>
-    <w:lvl w:ilvl="5">
-      <w:start w:val="1"/>
-      <w:numFmt w:val="lowerRoman"/>
-      <w:lvlText w:val="%6."/>
-      <w:lvlJc w:val="left"/>
-      <w:pPr>
-        <w:ind w:left="4320" w:hanging="360"/>
-      </w:pPr>
-      <w:rPr>
-        <w:rFonts w:ascii="Times New Roman" w:eastAsia="Times New Roman" w:hAnsi="Times New Roman" w:cs="Times New Roman"/>
-      </w:rPr>
-    </w:lvl>
-    <w:lvl w:ilvl="6">
-      <w:start w:val="1"/>
-      <w:numFmt w:val="decimal"/>
-      <w:lvlText w:val="%7."/>
-      <w:lvlJc w:val="left"/>
-      <w:pPr>
-        <w:ind w:left="5040" w:hanging="360"/>
-      </w:pPr>
-      <w:rPr>
-        <w:rFonts w:ascii="Times New Roman" w:eastAsia="Times New Roman" w:hAnsi="Times New Roman" w:cs="Times New Roman"/>
-      </w:rPr>
-    </w:lvl>
-    <w:lvl w:ilvl="7">
-      <w:start w:val="1"/>
-      <w:numFmt w:val="lowerLetter"/>
-      <w:lvlText w:val="%8."/>
-      <w:lvlJc w:val="right"/>
-      <w:pPr>
-        <w:ind w:left="5760" w:hanging="360"/>
-      </w:pPr>
-      <w:rPr>
-        <w:rFonts w:ascii="Times New Roman" w:eastAsia="Times New Roman" w:hAnsi="Times New Roman" w:cs="Times New Roman"/>
-      </w:rPr>
-    </w:lvl>
-    <w:lvl w:ilvl="8">
-      <w:start w:val="1"/>
-      <w:numFmt w:val="lowerRoman"/>
-      <w:lvlText w:val="%9."/>
-      <w:lvlJc w:val="left"/>
-      <w:pPr>
-        <w:ind w:left="6480" w:hanging="360"/>
-      </w:pPr>
-      <w:rPr>
-        <w:rFonts w:ascii="Times New Roman" w:eastAsia="Times New Roman" w:hAnsi="Times New Roman" w:cs="Times New Roman"/>
-      </w:rPr>
-    </w:lvl>
-  </w:abstractNum>
-  <w:abstractNum w:abstractNumId="3">
-    <w:nsid w:val="00000004"/>
-    <w:multiLevelType w:val="multilevel"/>
-    <w:tmpl w:val="00000000"/>
-    <w:name w:val="Bulleted_5819919f-3b01-4fc9-9a97-98a1ac4ba7d3"/>
-    <w:lvl w:ilvl="0">
-      <w:start w:val="1"/>
-      <w:numFmt w:val="bullet"/>
-      <w:lvlRestart w:val="1"/>
-      <w:lvlText w:val=""/>
-      <w:lvlJc w:val="left"/>
-      <w:pPr>
-        <w:ind w:left="720" w:hanging="360"/>
-      </w:pPr>
-      <w:rPr>
-        <w:rFonts w:ascii="Symbol" w:eastAsia="Symbol" w:hAnsi="Symbol" w:cs="Symbol"/>
-      </w:rPr>
-    </w:lvl>
-    <w:lvl w:ilvl="1">
-      <w:start w:val="1"/>
-      <w:numFmt w:val="bullet"/>
-      <w:lvlText w:val="o"/>
-      <w:lvlJc w:val="left"/>
-      <w:pPr>
-        <w:ind w:left="1440" w:hanging="360"/>
-      </w:pPr>
-      <w:rPr>
-        <w:rFonts w:ascii="Courier New" w:eastAsia="Courier New" w:hAnsi="Courier New" w:cs="Courier New"/>
-      </w:rPr>
-    </w:lvl>
-    <w:lvl w:ilvl="2">
-      <w:start w:val="1"/>
-      <w:numFmt w:val="bullet"/>
-      <w:lvlRestart w:val="1"/>
-      <w:lvlText w:val=""/>
-      <w:lvlJc w:val="left"/>
-      <w:pPr>
-        <w:ind w:left="2160" w:hanging="360"/>
-      </w:pPr>
-      <w:rPr>
-        <w:rFonts w:ascii="Wingdings" w:eastAsia="Wingdings" w:hAnsi="Wingdings" w:cs="Wingdings"/>
-      </w:rPr>
-    </w:lvl>
-    <w:lvl w:ilvl="3">
-      <w:start w:val="1"/>
-      <w:numFmt w:val="bullet"/>
-      <w:lvlRestart w:val="1"/>
-      <w:lvlText w:val=""/>
-      <w:lvlJc w:val="left"/>
-      <w:pPr>
-        <w:ind w:left="2880" w:hanging="360"/>
-      </w:pPr>
-      <w:rPr>
-        <w:rFonts w:ascii="Symbol" w:eastAsia="Symbol" w:hAnsi="Symbol" w:cs="Symbol"/>
-      </w:rPr>
-    </w:lvl>
-    <w:lvl w:ilvl="4">
-      <w:start w:val="1"/>
-      <w:numFmt w:val="bullet"/>
-      <w:lvlRestart w:val="1"/>
-      <w:lvlText w:val="o"/>
-      <w:lvlJc w:val="left"/>
-      <w:pPr>
-        <w:ind w:left="3600" w:hanging="360"/>
-      </w:pPr>
-      <w:rPr>
-        <w:rFonts w:ascii="Courier New" w:eastAsia="Courier New" w:hAnsi="Courier New" w:cs="Courier New"/>
-      </w:rPr>
-    </w:lvl>
-    <w:lvl w:ilvl="5">
-      <w:start w:val="1"/>
-      <w:numFmt w:val="bullet"/>
-      <w:lvlRestart w:val="1"/>
-      <w:lvlText w:val=""/>
-      <w:lvlJc w:val="left"/>
-      <w:pPr>
-        <w:ind w:left="4320" w:hanging="360"/>
-      </w:pPr>
-      <w:rPr>
-        <w:rFonts w:ascii="Wingdings" w:eastAsia="Wingdings" w:hAnsi="Wingdings" w:cs="Wingdings"/>
-      </w:rPr>
-    </w:lvl>
-    <w:lvl w:ilvl="6">
-      <w:start w:val="1"/>
-      <w:numFmt w:val="bullet"/>
-      <w:lvlRestart w:val="1"/>
-      <w:lvlText w:val=""/>
-      <w:lvlJc w:val="left"/>
-      <w:pPr>
-        <w:ind w:left="5040" w:hanging="360"/>
-      </w:pPr>
-      <w:rPr>
-        <w:rFonts w:ascii="Symbol" w:eastAsia="Symbol" w:hAnsi="Symbol" w:cs="Symbol"/>
-      </w:rPr>
-    </w:lvl>
-    <w:lvl w:ilvl="7">
-      <w:start w:val="1"/>
-      <w:numFmt w:val="bullet"/>
-      <w:lvlRestart w:val="1"/>
-      <w:lvlText w:val="o"/>
-      <w:lvlJc w:val="left"/>
-      <w:pPr>
-        <w:ind w:left="5760" w:hanging="360"/>
-      </w:pPr>
-      <w:rPr>
-        <w:rFonts w:ascii="Courier New" w:eastAsia="Courier New" w:hAnsi="Courier New" w:cs="Courier New"/>
-      </w:rPr>
-    </w:lvl>
-    <w:lvl w:ilvl="8">
-      <w:start w:val="1"/>
-      <w:numFmt w:val="bullet"/>
-      <w:lvlRestart w:val="1"/>
-      <w:lvlText w:val=""/>
-      <w:lvlJc w:val="left"/>
-      <w:pPr>
-        <w:ind w:left="6480" w:hanging="360"/>
-      </w:pPr>
-      <w:rPr>
-        <w:rFonts w:ascii="Wingdings" w:eastAsia="Wingdings" w:hAnsi="Wingdings" w:cs="Wingdings"/>
-      </w:rPr>
-    </w:lvl>
-  </w:abstractNum>
-  <w:abstractNum w:abstractNumId="4">
-    <w:nsid w:val="00000005"/>
-    <w:multiLevelType w:val="multilevel"/>
     <w:tmpl w:val="23469D34"/>
-    <w:name w:val="Numbered_11b44ddf-1e99-4a2e-ac16-e213476274b2"/>
+    <w:name w:val="Numbered_aec9d9b7-e661-4e47-8cb6-745c0f270609"/>
     <w:lvl w:ilvl="0">
       <w:start w:val="2"/>
       <w:numFmt w:val="decimal"/>
@@ -28500,11 +28171,11 @@
       </w:rPr>
     </w:lvl>
   </w:abstractNum>
-  <w:abstractNum w:abstractNumId="5">
-    <w:nsid w:val="00000006"/>
+  <w:abstractNum w:abstractNumId="3">
+    <w:nsid w:val="00000004"/>
     <w:multiLevelType w:val="hybridMultilevel"/>
     <w:tmpl w:val="27008992"/>
-    <w:name w:val="Bulleted_4a52e668-b74a-4cb8-a5f1-ac61ed1cc7e8"/>
+    <w:name w:val="Bulleted_7730b2e7-9006-461a-b18b-d6b3fb36fa6d"/>
     <w:lvl w:ilvl="0">
       <w:start w:val="0"/>
       <w:numFmt w:val="bullet"/>
@@ -28631,11 +28302,11 @@
       </w:rPr>
     </w:lvl>
   </w:abstractNum>
-  <w:abstractNum w:abstractNumId="6">
-    <w:nsid w:val="00000007"/>
+  <w:abstractNum w:abstractNumId="4">
+    <w:nsid w:val="00000005"/>
     <w:multiLevelType w:val="hybridMultilevel"/>
     <w:tmpl w:val="0B62F06A"/>
-    <w:name w:val="Numbered_7b319716-9baf-427d-bb80-f06086077cca"/>
+    <w:name w:val="Numbered_618d9a7b-6913-4eb8-ac26-cbb9445d88be"/>
     <w:lvl w:ilvl="0">
       <w:start w:val="1"/>
       <w:numFmt w:val="lowerLetter"/>
@@ -28763,11 +28434,11 @@
       </w:rPr>
     </w:lvl>
   </w:abstractNum>
-  <w:abstractNum w:abstractNumId="7">
-    <w:nsid w:val="00000008"/>
+  <w:abstractNum w:abstractNumId="5">
+    <w:nsid w:val="00000006"/>
     <w:multiLevelType w:val="hybridMultilevel"/>
     <w:tmpl w:val="496E7C1E"/>
-    <w:name w:val="Bulleted_073c023a-3a8b-4740-9d4c-acfb36c67843"/>
+    <w:name w:val="Bulleted_3dc21019-ebf0-42bb-81ca-2f4aff8a93d7"/>
     <w:lvl w:ilvl="0">
       <w:start w:val="0"/>
       <w:numFmt w:val="bullet"/>
@@ -28895,11 +28566,11 @@
       </w:rPr>
     </w:lvl>
   </w:abstractNum>
-  <w:abstractNum w:abstractNumId="8">
-    <w:nsid w:val="00000009"/>
+  <w:abstractNum w:abstractNumId="6">
+    <w:nsid w:val="00000007"/>
     <w:multiLevelType w:val="hybridMultilevel"/>
     <w:tmpl w:val="6F906604"/>
-    <w:name w:val="Bulleted_9cfc7b79-1809-4ba2-8879-9a87fe57bd92"/>
+    <w:name w:val="Bulleted_e760c90a-e31a-4194-987f-3abe3fbd0cd9"/>
     <w:lvl w:ilvl="0">
       <w:start w:val="0"/>
       <w:numFmt w:val="bullet"/>
@@ -29027,11 +28698,11 @@
       </w:rPr>
     </w:lvl>
   </w:abstractNum>
-  <w:abstractNum w:abstractNumId="9">
-    <w:nsid w:val="0000000A"/>
+  <w:abstractNum w:abstractNumId="7">
+    <w:nsid w:val="00000008"/>
     <w:multiLevelType w:val="hybridMultilevel"/>
     <w:tmpl w:val="1082B51C"/>
-    <w:name w:val="Numbered_b7f22c5f-b9b9-4f03-91ae-f080ff331842"/>
+    <w:name w:val="Numbered_72dbea95-49b7-4f76-89d9-cd24ffc845ed"/>
     <w:lvl w:ilvl="0">
       <w:start w:val="1"/>
       <w:numFmt w:val="decimal"/>
@@ -29159,11 +28830,11 @@
       </w:rPr>
     </w:lvl>
   </w:abstractNum>
-  <w:abstractNum w:abstractNumId="10">
-    <w:nsid w:val="0000000B"/>
+  <w:abstractNum w:abstractNumId="8">
+    <w:nsid w:val="00000009"/>
     <w:multiLevelType w:val="multilevel"/>
     <w:tmpl w:val="D714C610"/>
-    <w:name w:val="Numbered_fdd4a8c6-5f60-43c6-ab7e-451156f84cbe"/>
+    <w:name w:val="Numbered_5b6ee034-b29b-4410-bed4-8663966aff8c"/>
     <w:lvl w:ilvl="0">
       <w:start w:val="1"/>
       <w:numFmt w:val="decimal"/>
@@ -29309,11 +28980,11 @@
       </w:rPr>
     </w:lvl>
   </w:abstractNum>
-  <w:abstractNum w:abstractNumId="11">
-    <w:nsid w:val="0000000C"/>
+  <w:abstractNum w:abstractNumId="9">
+    <w:nsid w:val="0000000A"/>
     <w:multiLevelType w:val="hybridMultilevel"/>
     <w:tmpl w:val="2B9EBE96"/>
-    <w:name w:val="Numbered_f348991e-5755-4eae-9dd4-6adb47f15413"/>
+    <w:name w:val="Numbered_bde97347-f66c-4886-b921-902e8f696852"/>
     <w:lvl w:ilvl="0">
       <w:start w:val="1"/>
       <w:numFmt w:val="decimal"/>
@@ -29435,11 +29106,11 @@
       </w:rPr>
     </w:lvl>
   </w:abstractNum>
-  <w:abstractNum w:abstractNumId="12">
-    <w:nsid w:val="0000000D"/>
+  <w:abstractNum w:abstractNumId="10">
+    <w:nsid w:val="0000000B"/>
     <w:multiLevelType w:val="hybridMultilevel"/>
     <w:tmpl w:val="1E308D1C"/>
-    <w:name w:val="Numbered_07ff48da-5f32-4ffe-8b89-431a09362798"/>
+    <w:name w:val="Numbered_7ce3f74a-e2a3-4d22-9414-f3da05c7c0e8"/>
     <w:lvl w:ilvl="0">
       <w:start w:val="1"/>
       <w:numFmt w:val="decimal"/>
@@ -29561,11 +29232,11 @@
       </w:rPr>
     </w:lvl>
   </w:abstractNum>
-  <w:abstractNum w:abstractNumId="13">
-    <w:nsid w:val="0000000E"/>
+  <w:abstractNum w:abstractNumId="11">
+    <w:nsid w:val="0000000C"/>
     <w:multiLevelType w:val="multilevel"/>
     <w:tmpl w:val="6FD6E8B0"/>
-    <w:name w:val="Numbered_eb9975cc-cfe0-4c06-aba0-599ccee46bae"/>
+    <w:name w:val="Numbered_40b4cc64-64b0-4e89-ad68-6ebfa73d8b8e"/>
     <w:lvl w:ilvl="0">
       <w:start w:val="1"/>
       <w:numFmt w:val="decimal"/>
@@ -29703,11 +29374,11 @@
       </w:rPr>
     </w:lvl>
   </w:abstractNum>
-  <w:abstractNum w:abstractNumId="14">
-    <w:nsid w:val="0000000F"/>
+  <w:abstractNum w:abstractNumId="12">
+    <w:nsid w:val="0000000D"/>
     <w:multiLevelType w:val="hybridMultilevel"/>
     <w:tmpl w:val="1D522390"/>
-    <w:name w:val="Numbered_9fbaf82c-fba3-4f5a-bde0-85dabb8249d0"/>
+    <w:name w:val="Numbered_0668fab5-8e1f-4ac3-98d0-24f414dde202"/>
     <w:lvl w:ilvl="0">
       <w:start w:val="1"/>
       <w:numFmt w:val="decimal"/>
@@ -29829,11 +29500,11 @@
       </w:rPr>
     </w:lvl>
   </w:abstractNum>
-  <w:abstractNum w:abstractNumId="15">
-    <w:nsid w:val="00000010"/>
+  <w:abstractNum w:abstractNumId="13">
+    <w:nsid w:val="0000000E"/>
     <w:multiLevelType w:val="hybridMultilevel"/>
     <w:tmpl w:val="29E21FEC"/>
-    <w:name w:val="Bulleted_dc2ece45-bdaf-44b0-9d35-59e8cc9d9ba5"/>
+    <w:name w:val="Bulleted_c5d412a9-0a2e-45e0-b987-7dc3f17074da"/>
     <w:lvl w:ilvl="0">
       <w:start w:val="0"/>
       <w:numFmt w:val="bullet"/>
@@ -29961,11 +29632,11 @@
       </w:rPr>
     </w:lvl>
   </w:abstractNum>
-  <w:abstractNum w:abstractNumId="16">
-    <w:nsid w:val="00000011"/>
+  <w:abstractNum w:abstractNumId="14">
+    <w:nsid w:val="0000000F"/>
     <w:multiLevelType w:val="multilevel"/>
     <w:tmpl w:val="AE8E33B6"/>
-    <w:name w:val="Numbered_91d72fe4-b8e2-44da-896b-ddf3b1b7a980"/>
+    <w:name w:val="Numbered_8e439fcb-d0b8-4f7e-a621-bcfc9c3bc425"/>
     <w:lvl w:ilvl="0">
       <w:start w:val="2"/>
       <w:numFmt w:val="decimal"/>
@@ -30094,11 +29765,11 @@
       </w:rPr>
     </w:lvl>
   </w:abstractNum>
-  <w:abstractNum w:abstractNumId="17">
-    <w:nsid w:val="00000012"/>
+  <w:abstractNum w:abstractNumId="15">
+    <w:nsid w:val="00000010"/>
     <w:multiLevelType w:val="hybridMultilevel"/>
     <w:tmpl w:val="3414510A"/>
-    <w:name w:val="Bulleted_0af862ff-a217-4d91-b18f-234f71e6b97e"/>
+    <w:name w:val="Bulleted_85ef0406-8ced-4fc5-950e-92711af24af9"/>
     <w:lvl w:ilvl="0">
       <w:start w:val="0"/>
       <w:numFmt w:val="bullet"/>
@@ -30272,12 +29943,6 @@
   </w:num>
   <w:num w:numId="16">
     <w:abstractNumId w:val="15"/>
-  </w:num>
-  <w:num w:numId="17">
-    <w:abstractNumId w:val="16"/>
-  </w:num>
-  <w:num w:numId="18">
-    <w:abstractNumId w:val="17"/>
   </w:num>
 </w:numbering>
 </file>
@@ -30834,11 +30499,12 @@
   </w:style>
   <w:style w:type="table" w:styleId="TableGrid">
     <w:name w:val="Table Grid"/>
+    <w:basedOn w:val="TableNormal"/>
     <w:tblPr>
       <w:tblInd w:w="0" w:type="dxa"/>
       <w:tblBorders>
         <w:top w:val="single" w:sz="4" w:space="0" w:color="000000"/>
-        <w:left w:val="single" w:sz="4" w:space="0" w:color="000000"/>
+        <w:left val="single" sz="4" space="0" color="000000"/>
         <w:bottom w:val="single" w:sz="4" w:space="0" w:color="000000"/>
         <w:right w:val="single" w:sz="4" w:space="0" w:color="000000"/>
         <w:insideH w:val="single" w:sz="4" w:space="0" w:color="000000"/>

</xml_diff>

<commit_message>
loading page and UI redesigned
</commit_message>
<xml_diff>
--- a/src/faultless/mysite/media/documents/Geotechnical_Report_MW-A58_anon_CORRUPTED_v3_modified.docx
+++ b/src/faultless/mysite/media/documents/Geotechnical_Report_MW-A58_anon_CORRUPTED_v3_modified.docx
@@ -24,7 +24,7 @@
         <w:spacing w:after="100"/>
       </w:pPr>
       <w:r>
-        <w:t xml:space="preserve">Overall Document Quality Score: 42.6/100</w:t>
+        <w:t xml:space="preserve">Overall Document Quality Score: 37.7/100</w:t>
       </w:r>
     </w:p>
     <w:p>
@@ -40,7 +40,7 @@
         <w:spacing w:after="200"/>
       </w:pPr>
       <w:r>
-        <w:t xml:space="preserve">Severity Summary: 6 Critical, 20 Major, 12 Minor errors</w:t>
+        <w:t xml:space="preserve">Severity Summary: 7 Critical, 21 Major, 12 Minor errors</w:t>
       </w:r>
     </w:p>
     <w:p>
@@ -103,7 +103,7 @@
           <w:tcPr/>
           <w:p>
             <w:r>
-              <w:t xml:space="preserve">20</w:t>
+              <w:t xml:space="preserve">21</w:t>
             </w:r>
           </w:p>
         </w:tc>
@@ -111,7 +111,7 @@
           <w:tcPr/>
           <w:p>
             <w:r>
-              <w:t xml:space="preserve">40</w:t>
+              <w:t xml:space="preserve">42</w:t>
             </w:r>
           </w:p>
         </w:tc>
@@ -155,7 +155,7 @@
           <w:tcPr/>
           <w:p>
             <w:r>
-              <w:t xml:space="preserve">5</w:t>
+              <w:t xml:space="preserve">6</w:t>
             </w:r>
           </w:p>
         </w:tc>
@@ -163,7 +163,7 @@
           <w:tcPr/>
           <w:p>
             <w:r>
-              <w:t xml:space="preserve">25</w:t>
+              <w:t xml:space="preserve">30</w:t>
             </w:r>
           </w:p>
         </w:tc>
@@ -216,7 +216,7 @@
         <w:spacing w:after="100"/>
       </w:pPr>
       <w:r>
-        <w:t xml:space="preserve">Inconsistent unit usage (psi and kPa)</w:t>
+        <w:t xml:space="preserve">Inconsistent unit usage (psi/kPa, mm/m, kN/N).</w:t>
       </w:r>
     </w:p>
     <w:p>
@@ -227,7 +227,7 @@
         <w:spacing w:after="100"/>
       </w:pPr>
       <w:r>
-        <w:t xml:space="preserve">Inconsistent unit usage (mm and m)</w:t>
+        <w:t xml:space="preserve">Multiple spelling and grammatical errors throughout the report.</w:t>
       </w:r>
     </w:p>
     <w:p>
@@ -238,7 +238,7 @@
         <w:spacing w:after="100"/>
       </w:pPr>
       <w:r>
-        <w:t xml:space="preserve">Inconsistent terminology (volcanic ash vs Puketoka formation)</w:t>
+        <w:t xml:space="preserve">Inconsistent terminology (e.g., 'volcanic ash' vs. 'Auckland volcanic field ash').</w:t>
       </w:r>
     </w:p>
     <w:p>
@@ -249,7 +249,7 @@
         <w:spacing w:after="100"/>
       </w:pPr>
       <w:r>
-        <w:t xml:space="preserve">Inconsistent terminology (engineered fill vs hardfill)</w:t>
+        <w:t xml:space="preserve">Missing conclusion section.</w:t>
       </w:r>
     </w:p>
     <w:p>
@@ -260,7 +260,7 @@
         <w:spacing w:after="100"/>
       </w:pPr>
       <w:r>
-        <w:t xml:space="preserve">Inconsistent terminology (expansive soils vs reactive soils)</w:t>
+        <w:t xml:space="preserve">Incorrect client name: 'ClientCorp Ltd – Hoftes and Communities'.</w:t>
       </w:r>
     </w:p>
     <w:p>
@@ -271,7 +271,7 @@
         <w:spacing w:after="100"/>
       </w:pPr>
       <w:r>
-        <w:t xml:space="preserve">Inconsistent terminology (shallow foundations vs shallow pads vs strip footings)</w:t>
+        <w:t xml:space="preserve">Figure numbering inconsistency.</w:t>
       </w:r>
     </w:p>
     <w:p>
@@ -282,7 +282,7 @@
         <w:spacing w:after="100"/>
       </w:pPr>
       <w:r>
-        <w:t xml:space="preserve">Missing Conclusion section</w:t>
+        <w:t xml:space="preserve">Extra digit in reference: 'NZS 3604:20111'.</w:t>
       </w:r>
     </w:p>
     <w:p>
@@ -293,7 +293,7 @@
         <w:spacing w:after="100"/>
       </w:pPr>
       <w:r>
-        <w:t xml:space="preserve">Multiple spelling and grammatical errors</w:t>
+        <w:t xml:space="preserve">Run-on sentence in section regarding pile foundations.</w:t>
       </w:r>
     </w:p>
     <w:p>
@@ -314,103 +314,7 @@
         <w:spacing w:after="160"/>
       </w:pPr>
       <w:r>
-        <w:t xml:space="preserve">The report provides a good overview of the geotechnical conditions at the site and offers preliminary recommendations for civil design and building suitability. However, the report suffers from several inconsistencies and errors that need to be addressed to improve its quality and clarity.</w:t>
-      </w:r>
-    </w:p>
-    <w:p>
-      <w:pPr>
-        <w:spacing w:after="160"/>
-      </w:pPr>
-      <w:r>
-        <w:t xml:space="preserve">Here's a breakdown of areas for improvement:</w:t>
-      </w:r>
-    </w:p>
-    <w:p>
-      <w:pPr>
-        <w:spacing w:after="160"/>
-      </w:pPr>
-      <w:r>
-        <w:t xml:space="preserve">*   **Consistency:** The report lacks consistency in terminology (e.g., 'volcanic ash' vs. 'Puketoka formation', 'engineered fill' vs. 'hardfill', 'expansive soils' vs 'reactive soils', 'shallow foundations' vs 'shallow pads' vs 'strip footings') and units (mixing 'psi' and 'kPa', 'mm' and 'm', 'kN' and 'N'). Standardizing these will significantly improve readability and reduce potential for misinterpretation.</w:t>
-      </w:r>
-    </w:p>
-    <w:p>
-      <w:pPr>
-        <w:spacing w:after="160"/>
-      </w:pPr>
-      <w:r>
-        <w:t xml:space="preserve">*   **Grammar and Spelling:** Numerous spelling and grammatical errors detract from the report's professionalism. A thorough proofread is essential.</w:t>
-      </w:r>
-    </w:p>
-    <w:p>
-      <w:pPr>
-        <w:spacing w:after="160"/>
-      </w:pPr>
-      <w:r>
-        <w:t xml:space="preserve">*   **Clarity:** Some sentences are awkwardly phrased and could benefit from rephrasing for better clarity.</w:t>
-      </w:r>
-    </w:p>
-    <w:p>
-      <w:pPr>
-        <w:spacing w:after="160"/>
-      </w:pPr>
-      <w:r>
-        <w:t xml:space="preserve">*   **Completeness:** The report lacks a concluding section to summarize key findings and recommendations.</w:t>
-      </w:r>
-    </w:p>
-    <w:p>
-      <w:pPr>
-        <w:spacing w:after="160"/>
-      </w:pPr>
-      <w:r>
-        <w:t xml:space="preserve">*   **Accuracy:** Ensure all technical information, especially regarding soil properties and design parameters, is accurate and well-supported by the investigation data.</w:t>
-      </w:r>
-    </w:p>
-    <w:p>
-      <w:pPr>
-        <w:spacing w:after="160"/>
-      </w:pPr>
-      <w:r>
-        <w:t xml:space="preserve">To improve the report, focus on:</w:t>
-      </w:r>
-    </w:p>
-    <w:p>
-      <w:pPr>
-        <w:spacing w:after="160"/>
-      </w:pPr>
-      <w:r>
-        <w:t xml:space="preserve">1.  **Proofreading:** Conduct a thorough review for spelling and grammar errors.</w:t>
-      </w:r>
-    </w:p>
-    <w:p>
-      <w:pPr>
-        <w:spacing w:after="160"/>
-      </w:pPr>
-      <w:r>
-        <w:t xml:space="preserve">2.  **Standardization:** Choose consistent terminology and units throughout the report.</w:t>
-      </w:r>
-    </w:p>
-    <w:p>
-      <w:pPr>
-        <w:spacing w:after="160"/>
-      </w:pPr>
-      <w:r>
-        <w:t xml:space="preserve">3.  **Clarity:** Rephrase ambiguous sentences for better understanding.</w:t>
-      </w:r>
-    </w:p>
-    <w:p>
-      <w:pPr>
-        <w:spacing w:after="160"/>
-      </w:pPr>
-      <w:r>
-        <w:t xml:space="preserve">4.  **Conclusion:** Add a conclusion summarizing the key findings and recommendations.</w:t>
-      </w:r>
-    </w:p>
-    <w:p>
-      <w:pPr>
-        <w:spacing w:after="160"/>
-      </w:pPr>
-      <w:r>
-        <w:t xml:space="preserve">5.  **Review:** Have a senior geotechnical engineer review the report for technical accuracy and completeness.</w:t>
+        <w:t xml:space="preserve">The report provides a comprehensive geotechnical assessment for the proposed subdivision development. However, the report suffers from a lack of attention to detail, particularly in grammar, spelling, and consistency. The inconsistent use of units (psi/kPa, mm/m, kN/N) and terminology (e.g., 'volcanic ash' vs. 'Auckland volcanic field ash', 'shallow foundations' vs. 'shallow footings') throughout the document creates confusion and reduces its professional credibility. The report also needs a conclusion section to summarize the key findings and recommendations. Addressing these issues will significantly improve the report's clarity, accuracy, and overall quality. Proofreading the entire document is highly recommended before distribution.</w:t>
       </w:r>
     </w:p>
     <w:p>
@@ -3623,19 +3527,19 @@
         <w:spacing w:line="264" w:lineRule="auto"/>
         <w:ind w:left="120" w:right="210"/>
       </w:pPr>
+      <w:r>
+        <w:t xml:space="preserve">ClientCorp Ltd will also provide this report to build partners to </w:t>
+      </w:r>
       <w:commentRangeStart w:id="0"/>
       <w:r>
-        <w:t xml:space="preserve">ClientCorp Ltd will also provide this report to build partners to inforft them in assessing the suitability of the land for buildings.</w:t>
+        <w:t xml:space="preserve">inforft</w:t>
       </w:r>
       <w:commentRangeEnd w:id="0"/>
       <w:r>
         <w:commentReference w:id="0"/>
       </w:r>
       <w:r>
-        <w:commentReference w:id="1"/>
-      </w:r>
-      <w:r>
-        <w:t xml:space="preserve"> This report:</w:t>
+        <w:t xml:space="preserve"> them in assessing the suitability of the land for buildings. This report:</w:t>
       </w:r>
     </w:p>
     <w:p>
@@ -6155,16 +6059,24 @@
               </w:rPr>
               <w:t xml:space="preserve"> </w:t>
             </w:r>
-            <w:commentRangeStart w:id="2"/>
-            <w:r>
-              <w:rPr>
-                <w:sz w:val="20"/>
-              </w:rPr>
-              <w:t xml:space="preserve">volcanic ash</w:t>
-            </w:r>
-            <w:commentRangeEnd w:id="2"/>
-            <w:r>
-              <w:commentReference w:id="2"/>
+            <w:r>
+              <w:rPr>
+                <w:sz w:val="20"/>
+              </w:rPr>
+              <w:t xml:space="preserve">volcanic</w:t>
+            </w:r>
+            <w:r>
+              <w:rPr>
+                <w:spacing w:val="-5"/>
+                <w:sz w:val="20"/>
+              </w:rPr>
+              <w:t xml:space="preserve"> </w:t>
+            </w:r>
+            <w:r>
+              <w:rPr>
+                <w:sz w:val="20"/>
+              </w:rPr>
+              <w:t xml:space="preserve">ash</w:t>
             </w:r>
             <w:r>
               <w:rPr>
@@ -8373,24 +8285,16 @@
               </w:rPr>
               <w:t xml:space="preserve"> </w:t>
             </w:r>
-            <w:r>
-              <w:rPr>
-                <w:sz w:val="20"/>
-              </w:rPr>
-              <w:t xml:space="preserve">volcanic</w:t>
-            </w:r>
-            <w:r>
-              <w:rPr>
-                <w:spacing w:val="-5"/>
-                <w:sz w:val="20"/>
-              </w:rPr>
-              <w:t xml:space="preserve"> </w:t>
-            </w:r>
-            <w:r>
-              <w:rPr>
-                <w:sz w:val="20"/>
-              </w:rPr>
-              <w:t xml:space="preserve">ash</w:t>
+            <w:commentRangeStart w:id="1"/>
+            <w:r>
+              <w:rPr>
+                <w:sz w:val="20"/>
+              </w:rPr>
+              <w:t xml:space="preserve">volcanic ash</w:t>
+            </w:r>
+            <w:commentRangeEnd w:id="1"/>
+            <w:r>
+              <w:commentReference w:id="1"/>
             </w:r>
             <w:r>
               <w:rPr>
@@ -9626,7 +9530,18 @@
         <w:ind w:left="120"/>
       </w:pPr>
       <w:r>
-        <w:t xml:space="preserve">The SolidEarth Alliance has been engaged by ClientCorp Ltd – Hoftes and Communities to investigate, design, construct and deliver a scope of civil works as part of redevelopment of the Phase 2 &amp; 3 Evergreen West</w:t>
+        <w:t xml:space="preserve">The SolidEarth Alliance has been engaged by </w:t>
+      </w:r>
+      <w:commentRangeStart w:id="2"/>
+      <w:r>
+        <w:t xml:space="preserve">ClientCorp Ltd – Hoftes and Communities</w:t>
+      </w:r>
+      <w:commentRangeEnd w:id="2"/>
+      <w:r>
+        <w:commentReference w:id="2"/>
+      </w:r>
+      <w:r>
+        <w:t xml:space="preserve"> to investigate, design, construct and deliver a scope of civil works as part of redevelopment of the Phase 2 &amp; 3 Evergreen West</w:t>
       </w:r>
     </w:p>
     <w:p>
@@ -9696,18 +9611,7 @@
         <w:ind w:left="120"/>
       </w:pPr>
       <w:r>
-        <w:t xml:space="preserve">recommendations for land remediation are presented in a separate report, </w:t>
-      </w:r>
-      <w:commentRangeStart w:id="4"/>
-      <w:r>
-        <w:t xml:space="preserve">Land Remediation Investigation Report: Land Remediation Investigation Report:</w:t>
-      </w:r>
-      <w:commentRangeEnd w:id="4"/>
-      <w:r>
-        <w:commentReference w:id="4"/>
-      </w:r>
-      <w:r>
-        <w:t xml:space="preserve"> Evergreen West Development – Stages 2 &amp; 3 – Draft, dated March 2019 (version 1.0).</w:t>
+        <w:t xml:space="preserve">recommendations for land remediation are presented in a separate report, Land Remediation Investigation Report: Land Remediation Investigation Report: Evergreen West Development – Stages 2 &amp; 3 – Draft, dated March 2019 (version 1.0).</w:t>
       </w:r>
     </w:p>
     <w:p>
@@ -9784,13 +9688,13 @@
       <w:r>
         <w:t xml:space="preserve">If the nature of the proposed </w:t>
       </w:r>
-      <w:commentRangeStart w:id="5"/>
+      <w:commentRangeStart w:id="4"/>
       <w:r>
         <w:t xml:space="preserve">developftent</w:t>
       </w:r>
-      <w:commentRangeEnd w:id="5"/>
-      <w:r>
-        <w:commentReference w:id="5"/>
+      <w:commentRangeEnd w:id="4"/>
+      <w:r>
+        <w:commentReference w:id="4"/>
       </w:r>
       <w:r>
         <w:t xml:space="preserve"> differs from that assumed in this report, it is important that we are given the opportunity to revise the contents of this report.</w:t>
@@ -9918,13 +9822,13 @@
       <w:r>
         <w:t xml:space="preserve">NZGD does not show any historical investigations in the </w:t>
       </w:r>
-      <w:commentRangeStart w:id="6"/>
+      <w:commentRangeStart w:id="5"/>
       <w:r>
         <w:t xml:space="preserve">iftmediate</w:t>
       </w:r>
-      <w:commentRangeEnd w:id="6"/>
-      <w:r>
-        <w:commentReference w:id="6"/>
+      <w:commentRangeEnd w:id="5"/>
+      <w:r>
+        <w:commentReference w:id="5"/>
       </w:r>
       <w:r>
         <w:t xml:space="preserve"> area (i.e. 100m radius) of the Superlot.</w:t>
@@ -15008,13 +14912,13 @@
       <w:r>
         <w:t xml:space="preserve">significant variance in the undrained shear strengths of this material, with results ranging from </w:t>
       </w:r>
-      <w:commentRangeStart w:id="7"/>
+      <w:commentRangeStart w:id="6"/>
       <w:r>
         <w:t xml:space="preserve">17 to 200 psi</w:t>
       </w:r>
-      <w:commentRangeEnd w:id="7"/>
-      <w:r>
-        <w:commentReference w:id="7"/>
+      <w:commentRangeEnd w:id="6"/>
+      <w:r>
+        <w:commentReference w:id="6"/>
       </w:r>
       <w:r>
         <w:t xml:space="preserve">.</w:t>
@@ -15399,16 +15303,8 @@
         <w:spacing w:before="106"/>
         <w:ind w:hanging="360"/>
       </w:pPr>
-      <w:commentRangeStart w:id="8"/>
-      <w:r>
-        <w:t xml:space="preserve">Coftpressible</w:t>
-      </w:r>
-      <w:commentRangeEnd w:id="8"/>
-      <w:r>
-        <w:commentReference w:id="8"/>
-      </w:r>
-      <w:r>
-        <w:t xml:space="preserve"> soils and settlement</w:t>
+      <w:r>
+        <w:t xml:space="preserve">Coftpressible soils and settlement</w:t>
       </w:r>
     </w:p>
     <w:p>
@@ -15425,7 +15321,18 @@
         <w:ind w:right="1065"/>
       </w:pPr>
       <w:r>
-        <w:t xml:space="preserve">Subsoil characteristics and strength and whether the residential units can be designed to NZS 3604:20111 “good ground” conditions.</w:t>
+        <w:t xml:space="preserve">Subsoil characteristics and strength and whether the residential units can be designed to </w:t>
+      </w:r>
+      <w:commentRangeStart w:id="7"/>
+      <w:r>
+        <w:t xml:space="preserve">NZS 3604:20111</w:t>
+      </w:r>
+      <w:commentRangeEnd w:id="7"/>
+      <w:r>
+        <w:commentReference w:id="7"/>
+      </w:r>
+      <w:r>
+        <w:t xml:space="preserve"> “good ground” conditions.</w:t>
       </w:r>
     </w:p>
     <w:p>
@@ -15478,13 +15385,13 @@
       <w:r>
         <w:t xml:space="preserve">Subgrade for </w:t>
       </w:r>
-      <w:commentRangeStart w:id="9"/>
+      <w:commentRangeStart w:id="8"/>
       <w:r>
         <w:t xml:space="preserve">paveftents</w:t>
       </w:r>
-      <w:commentRangeEnd w:id="9"/>
-      <w:r>
-        <w:commentReference w:id="9"/>
+      <w:commentRangeEnd w:id="8"/>
+      <w:r>
+        <w:commentReference w:id="8"/>
       </w:r>
       <w:r>
         <w:t xml:space="preserve">.</w:t>
@@ -15536,18 +15443,7 @@
         <w:ind w:left="120"/>
       </w:pPr>
       <w:r>
-        <w:t xml:space="preserve">An upper “crust” of stronger soil was encountered beneath the topsoil layer across </w:t>
-      </w:r>
-      <w:commentRangeStart w:id="10"/>
-      <w:r>
-        <w:t xml:space="preserve">Superlot MW – A58</w:t>
-      </w:r>
-      <w:commentRangeEnd w:id="10"/>
-      <w:r>
-        <w:commentReference w:id="10"/>
-      </w:r>
-      <w:r>
-        <w:t xml:space="preserve">.</w:t>
+        <w:t xml:space="preserve">An upper “crust” of stronger soil was encountered beneath the topsoil layer across Superlot MW – A58.</w:t>
       </w:r>
     </w:p>
     <w:p>
@@ -15745,18 +15641,13 @@
       <w:r>
         <w:t xml:space="preserve">It is likely that the soils at the foundation elevation will be prone to shrinkage and swelling when exposed to changes in </w:t>
       </w:r>
-      <w:commentRangeStart w:id="11"/>
-      <w:commentRangeStart w:id="12"/>
+      <w:commentRangeStart w:id="9"/>
       <w:r>
         <w:t xml:space="preserve">ftoisture</w:t>
       </w:r>
-      <w:commentRangeEnd w:id="12"/>
-      <w:r>
-        <w:commentReference w:id="12"/>
-      </w:r>
-      <w:commentRangeEnd w:id="11"/>
-      <w:r>
-        <w:commentReference w:id="11"/>
+      <w:commentRangeEnd w:id="9"/>
+      <w:r>
+        <w:commentReference w:id="9"/>
       </w:r>
       <w:r>
         <w:t xml:space="preserve"> content. The effects on freshly exposed material in cuts may be greater than soils that have been previously subject to seasonal cycles and this needs to be considered in design of foundations.</w:t>
@@ -15874,13 +15765,13 @@
       <w:r>
         <w:t xml:space="preserve">trench excavations to a </w:t>
       </w:r>
-      <w:commentRangeStart w:id="13"/>
+      <w:commentRangeStart w:id="10"/>
       <w:r>
         <w:t xml:space="preserve">ftinimum</w:t>
       </w:r>
-      <w:commentRangeEnd w:id="13"/>
-      <w:r>
-        <w:commentReference w:id="13"/>
+      <w:commentRangeEnd w:id="10"/>
+      <w:r>
+        <w:commentReference w:id="10"/>
       </w:r>
       <w:r>
         <w:t xml:space="preserve"> of three times the excavation depth away from existing structures.</w:t>
@@ -15912,13 +15803,13 @@
         <w:spacing w:line="268" w:lineRule="exact"/>
         <w:ind w:left="120"/>
       </w:pPr>
-      <w:commentRangeStart w:id="14"/>
+      <w:commentRangeStart w:id="11"/>
       <w:r>
         <w:t xml:space="preserve">daftage</w:t>
       </w:r>
-      <w:commentRangeEnd w:id="14"/>
-      <w:r>
-        <w:commentReference w:id="14"/>
+      <w:commentRangeEnd w:id="11"/>
+      <w:r>
+        <w:commentReference w:id="11"/>
       </w:r>
       <w:r>
         <w:t xml:space="preserve"> to buildings and infrastructure.</w:t>
@@ -16034,13 +15925,13 @@
       <w:r>
         <w:t xml:space="preserve">(</w:t>
       </w:r>
-      <w:commentRangeStart w:id="15"/>
+      <w:commentRangeStart w:id="12"/>
       <w:r>
         <w:t xml:space="preserve">Noveftber</w:t>
       </w:r>
-      <w:commentRangeEnd w:id="15"/>
-      <w:r>
-        <w:commentReference w:id="15"/>
+      <w:commentRangeEnd w:id="12"/>
+      <w:r>
+        <w:commentReference w:id="12"/>
       </w:r>
       <w:r>
         <w:t xml:space="preserve"> to April). Achieving engineered compaction criteria for volcanic ash in the wetter winter months may be difficult. If earthworks proceed outside of summer, lime stabilisation or other conditioning of the</w:t>
@@ -16166,18 +16057,18 @@
         <w:ind w:left="120"/>
       </w:pPr>
       <w:r>
-        <w:t xml:space="preserve">A preliminary compaction specification for bulk fill using site-won volcanic soils, imported cohesive fill or imported </w:t>
-      </w:r>
-      <w:commentRangeStart w:id="16"/>
-      <w:r>
-        <w:t xml:space="preserve">hardfill</w:t>
-      </w:r>
-      <w:commentRangeEnd w:id="16"/>
-      <w:r>
-        <w:commentReference w:id="16"/>
-      </w:r>
-      <w:r>
-        <w:t xml:space="preserve"> materials is provided below:</w:t>
+        <w:t xml:space="preserve">A preliminary compaction specification for bulk fill using </w:t>
+      </w:r>
+      <w:commentRangeStart w:id="13"/>
+      <w:r>
+        <w:t xml:space="preserve">site-won volcanic soils</w:t>
+      </w:r>
+      <w:commentRangeEnd w:id="13"/>
+      <w:r>
+        <w:commentReference w:id="13"/>
+      </w:r>
+      <w:r>
+        <w:t xml:space="preserve">, imported cohesive fill or imported hardfill materials is provided below:</w:t>
       </w:r>
     </w:p>
     <w:p>
@@ -17263,13 +17154,13 @@
       <w:r>
         <w:t xml:space="preserve">On the basis of the available </w:t>
       </w:r>
-      <w:commentRangeStart w:id="17"/>
+      <w:commentRangeStart w:id="14"/>
       <w:r>
         <w:t xml:space="preserve">inforftation</w:t>
       </w:r>
-      <w:commentRangeEnd w:id="17"/>
-      <w:r>
-        <w:commentReference w:id="17"/>
+      <w:commentRangeEnd w:id="14"/>
+      <w:r>
+        <w:commentReference w:id="14"/>
       </w:r>
       <w:r>
         <w:t xml:space="preserve">, shallow or piled foundation are likely to be suitable options to</w:t>
@@ -17479,18 +17370,7 @@
         <w:ind w:left="120"/>
       </w:pPr>
       <w:r>
-        <w:t xml:space="preserve">The parameters in Table 5 can be assumed for preliminary foundation design for buildings on </w:t>
-      </w:r>
-      <w:commentRangeStart w:id="18"/>
-      <w:r>
-        <w:t xml:space="preserve">shallow pads</w:t>
-      </w:r>
-      <w:commentRangeEnd w:id="18"/>
-      <w:r>
-        <w:commentReference w:id="18"/>
-      </w:r>
-      <w:r>
-        <w:t xml:space="preserve"> and strip footings. This should be reduced by a geotechnical reduction factor, φ = 0.5 when comparing with factored ultimate limit state (ULS) structural loads.</w:t>
+        <w:t xml:space="preserve">The parameters in Table 5 can be assumed for preliminary foundation design for buildings on shallow pads and strip footings. This should be reduced by a geotechnical reduction factor, φ = 0.5 when comparing with factored ultimate limit state (ULS) structural loads.</w:t>
       </w:r>
     </w:p>
     <w:p>
@@ -18162,13 +18042,13 @@
       <w:r>
         <w:t xml:space="preserve">NOTE 1: The foundation subgrade should have an undrained shear strength of not less than </w:t>
       </w:r>
-      <w:commentRangeStart w:id="19"/>
+      <w:commentRangeStart w:id="15"/>
       <w:r>
         <w:t xml:space="preserve">80 psi</w:t>
       </w:r>
-      <w:commentRangeEnd w:id="19"/>
-      <w:r>
-        <w:commentReference w:id="19"/>
+      <w:commentRangeEnd w:id="15"/>
+      <w:r>
+        <w:commentReference w:id="15"/>
       </w:r>
       <w:r>
         <w:t xml:space="preserve"> to at least 1 ft beneath the base of the footing (based on a review of the nearest boreholes by a Chartered Professional Geotechnical Engineer). This can comprise the natural crust or engineered fill.</w:t>
@@ -19551,18 +19431,7 @@
         <w:ind w:left="120"/>
       </w:pPr>
       <w:r>
-        <w:t xml:space="preserve">joints should be used to </w:t>
-      </w:r>
-      <w:commentRangeStart w:id="20"/>
-      <w:r>
-        <w:t xml:space="preserve">ftitigate</w:t>
-      </w:r>
-      <w:commentRangeEnd w:id="20"/>
-      <w:r>
-        <w:commentReference w:id="20"/>
-      </w:r>
-      <w:r>
-        <w:t xml:space="preserve"> the effects of differential foundation settlement. For example, movement joints between adjoining terrace houses may be necessary to mitigate against differential settlement risks.</w:t>
+        <w:t xml:space="preserve">joints should be used to ftitigate the effects of differential foundation settlement. For example, movement joints between adjoining terrace houses may be necessary to mitigate against differential settlement risks.</w:t>
       </w:r>
     </w:p>
     <w:p>
@@ -19672,13 +19541,13 @@
       <w:r>
         <w:t xml:space="preserve">Expansive soils (or “</w:t>
       </w:r>
-      <w:commentRangeStart w:id="21"/>
+      <w:commentRangeStart w:id="16"/>
       <w:r>
         <w:t xml:space="preserve">reactive soils</w:t>
       </w:r>
-      <w:commentRangeEnd w:id="21"/>
-      <w:r>
-        <w:commentReference w:id="21"/>
+      <w:commentRangeEnd w:id="16"/>
+      <w:r>
+        <w:commentReference w:id="16"/>
       </w:r>
       <w:r>
         <w:t xml:space="preserve">” using Australian terminology) are clay soils that undergo appreciable</w:t>
@@ -19928,8 +19797,16 @@
         <w:spacing w:before="120" w:line="264" w:lineRule="auto"/>
         <w:ind w:right="1114"/>
       </w:pPr>
-      <w:r>
-        <w:t xml:space="preserve">A stiffened raft design in accordance with Class H2, extending a minimum of 600mm into the underlying natural soils.</w:t>
+      <w:commentRangeStart w:id="17"/>
+      <w:r>
+        <w:t xml:space="preserve">A stiffened raft design in accordance with Class H2, extending a minimum of 600mm into the underlying natural soils</w:t>
+      </w:r>
+      <w:commentRangeEnd w:id="17"/>
+      <w:r>
+        <w:commentReference w:id="17"/>
+      </w:r>
+      <w:r>
+        <w:t xml:space="preserve">.</w:t>
       </w:r>
     </w:p>
     <w:p>
@@ -21329,13 +21206,13 @@
       <w:r>
         <w:t xml:space="preserve">If loads are applied to the ground surface (e.g. </w:t>
       </w:r>
-      <w:commentRangeStart w:id="22"/>
+      <w:commentRangeStart w:id="18"/>
       <w:r>
         <w:t xml:space="preserve">placeftent</w:t>
       </w:r>
-      <w:commentRangeEnd w:id="22"/>
-      <w:r>
-        <w:commentReference w:id="22"/>
+      <w:commentRangeEnd w:id="18"/>
+      <w:r>
+        <w:commentReference w:id="18"/>
       </w:r>
       <w:r>
         <w:t xml:space="preserve"> of fill or structures on shallow foundations),</w:t>
@@ -21422,13 +21299,13 @@
       <w:r>
         <w:t xml:space="preserve">Table 8: Retention design </w:t>
       </w:r>
-      <w:commentRangeStart w:id="23"/>
+      <w:commentRangeStart w:id="19"/>
       <w:r>
         <w:t xml:space="preserve">parafteters</w:t>
       </w:r>
-      <w:commentRangeEnd w:id="23"/>
-      <w:r>
-        <w:commentReference w:id="23"/>
+      <w:commentRangeEnd w:id="19"/>
+      <w:r>
+        <w:commentReference w:id="19"/>
       </w:r>
     </w:p>
     <w:p>
@@ -23779,8 +23656,13 @@
         <w:pStyle w:val="Heading4"/>
         <w:spacing w:before="176"/>
       </w:pPr>
+      <w:commentRangeStart w:id="20"/>
       <w:r>
         <w:t xml:space="preserve">Figure 2: Allowable horizontal offset between building foundations and retaining wall</w:t>
+      </w:r>
+      <w:commentRangeEnd w:id="20"/>
+      <w:r>
+        <w:commentReference w:id="20"/>
       </w:r>
     </w:p>
     <w:p>
@@ -23798,13 +23680,13 @@
         <w:spacing w:before="1" w:line="264" w:lineRule="auto"/>
         <w:ind w:left="120"/>
       </w:pPr>
-      <w:commentRangeStart w:id="24"/>
+      <w:commentRangeStart w:id="21"/>
       <w:r>
         <w:t xml:space="preserve">Assufting</w:t>
       </w:r>
-      <w:commentRangeEnd w:id="24"/>
-      <w:r>
-        <w:commentReference w:id="24"/>
+      <w:commentRangeEnd w:id="21"/>
+      <w:r>
+        <w:commentReference w:id="21"/>
       </w:r>
       <w:r>
         <w:t xml:space="preserve"> a 45° zone of influence and a horizontal backslope, the minimum safe horizontal offset (x) may be calculated as:</w:t>
@@ -24099,13 +23981,13 @@
       <w:r>
         <w:t xml:space="preserve">Based on our </w:t>
       </w:r>
-      <w:commentRangeStart w:id="25"/>
+      <w:commentRangeStart w:id="22"/>
       <w:r>
         <w:t xml:space="preserve">preliftinary</w:t>
       </w:r>
-      <w:commentRangeEnd w:id="25"/>
-      <w:r>
-        <w:commentReference w:id="25"/>
+      <w:commentRangeEnd w:id="22"/>
+      <w:r>
+        <w:commentReference w:id="22"/>
       </w:r>
       <w:r>
         <w:t xml:space="preserve"> assessment, the site is considered to have a low susceptibility of cyclic softening. This low susceptibility to cyclic softening and the distance to the nearest open face (for lateral spread to occur) from the subject site results in a low risk of lateral spread or instability as a result of cyclic softening.</w:t>
@@ -24162,13 +24044,13 @@
       <w:r>
         <w:t xml:space="preserve">Chartered Geotechnical Engineer. Depending on the building </w:t>
       </w:r>
-      <w:commentRangeStart w:id="26"/>
+      <w:commentRangeStart w:id="23"/>
       <w:r>
         <w:t xml:space="preserve">forft</w:t>
       </w:r>
-      <w:commentRangeEnd w:id="26"/>
-      <w:r>
-        <w:commentReference w:id="26"/>
+      <w:commentRangeEnd w:id="23"/>
+      <w:r>
+        <w:commentReference w:id="23"/>
       </w:r>
       <w:r>
         <w:t xml:space="preserve">, it may be necessary to carry out</w:t>
@@ -24307,192 +24189,171 @@
 
 <file path=word/comments.xml><?xml version="1.0" encoding="utf-8"?>
 <w:comments xmlns:wpc="http://schemas.microsoft.com/office/word/2010/wordprocessingCanvas" xmlns:cx="http://schemas.microsoft.com/office/drawing/2014/chartex" xmlns:cx1="http://schemas.microsoft.com/office/drawing/2015/9/8/chartex" xmlns:cx2="http://schemas.microsoft.com/office/drawing/2015/10/21/chartex" xmlns:cx3="http://schemas.microsoft.com/office/drawing/2016/5/9/chartex" xmlns:cx4="http://schemas.microsoft.com/office/drawing/2016/5/10/chartex" xmlns:cx5="http://schemas.microsoft.com/office/drawing/2016/5/11/chartex" xmlns:mc="http://schemas.openxmlformats.org/markup-compatibility/2006" xmlns:o="urn:schemas-microsoft-com:office:office" xmlns:r="http://schemas.openxmlformats.org/officeDocument/2006/relationships" xmlns:m="http://schemas.openxmlformats.org/officeDocument/2006/math" xmlns:v="urn:schemas-microsoft-com:vml" xmlns:wp14="http://schemas.microsoft.com/office/word/2010/wordprocessingDrawing" xmlns:wp="http://schemas.openxmlformats.org/drawingml/2006/wordprocessingDrawing" xmlns:w10="urn:schemas-microsoft-com:office:word" xmlns:w="http://schemas.openxmlformats.org/wordprocessingml/2006/main" xmlns:w14="http://schemas.microsoft.com/office/word/2010/wordml" xmlns:w15="http://schemas.microsoft.com/office/word/2012/wordml" xmlns:wne="http://schemas.microsoft.com/office/word/2006/wordml" xmlns:wpg="http://schemas.microsoft.com/office/word/2010/wordprocessingGroup" xmlns:wpi="http://schemas.microsoft.com/office/word/2010/wordprocessingInk" xmlns:wps="http://schemas.microsoft.com/office/word/2010/wordprocessingShape" mc:Ignorable="w14 w15 wp14">
-  <w:comment w:id="0" w:author=" [MAJOR] Grammar and Spelling Check" w:date="2025-05-29T13:12:44Z" w:initials="AI">
-    <w:p>
-      <w:r>
-        <w:t xml:space="preserve">The sentence 'ClientCorp Ltd will also provide this report to build partners to inforft them in assessing the suitability of the land for buildings.' is grammatically incorrect. Consider rephrasing for clarity, such as: 'ClientCorp Ltd will also provide this report to building partners to inform them about assessing the suitability of the land for buildings.'</w:t>
+  <w:comment w:id="0" w:author=" [MAJOR] Grammar and Spelling Check" w:date="2025-05-30T01:37:12Z" w:initials="AI">
+    <w:p>
+      <w:r>
+        <w:t xml:space="preserve">Correct the spelling error. 'inforft' should be 'inform'.</w:t>
       </w:r>
     </w:p>
   </w:comment>
-  <w:comment w:id="1" w:author=" [MAJOR] Grammar and Spelling Check" w:date="2025-05-29T13:12:44Z" w:initials="AI">
-    <w:p>
-      <w:r>
-        <w:t xml:space="preserve">Correct the spelling error from 'inforft' to 'inform'.</w:t>
+  <w:comment w:id="1" w:author=" [CRITICAL] Terminology Consistency" w:date="2025-05-30T01:37:31Z" w:initials="AI">
+    <w:p>
+      <w:r>
+        <w:t xml:space="preserve">The report uses both 'volcanic ash' and 'Auckland volcanic field ash' to refer to the same material. Standardize to one term, preferably 'Auckland volcanic field ash' for clarity.</w:t>
       </w:r>
     </w:p>
   </w:comment>
-  <w:comment w:id="2" w:author=" [CRITICAL] Terminology Consistency" w:date="2025-05-29T13:13:00Z" w:initials="AI">
-    <w:p>
-      <w:r>
-        <w:t xml:space="preserve">The terms 'volcanic ash' and 'Puketoka formation' are used interchangeably. Choose one term and use it consistently throughout the report.</w:t>
+  <w:comment w:id="2" w:author=" [MAJOR] Grammar and Spelling Check" w:date="2025-05-30T01:37:12Z" w:initials="AI">
+    <w:p>
+      <w:r>
+        <w:t xml:space="preserve">The phrase 'ClientCorp Ltd – Hoftes and Communities' seems incorrect. Please verify and correct the name.</w:t>
       </w:r>
     </w:p>
   </w:comment>
-  <w:comment w:id="3" w:author=" [MAJOR] Grammar and Spelling Check" w:date="2025-05-29T13:12:44Z" w:initials="AI">
-    <w:p>
-      <w:r>
-        <w:t xml:space="preserve">Correct the spelling error from 'reftediation' to 'remediation'.</w:t>
+  <w:comment w:id="3" w:author=" [MAJOR] Grammar and Spelling Check" w:date="2025-05-30T01:37:12Z" w:initials="AI">
+    <w:p>
+      <w:r>
+        <w:t xml:space="preserve">Correct the spelling error. 'reftediation' should be 'remediation'.</w:t>
       </w:r>
     </w:p>
   </w:comment>
-  <w:comment w:id="4" w:author=" [MAJOR] Grammar and Spelling Check" w:date="2025-05-29T13:12:44Z" w:initials="AI">
-    <w:p>
-      <w:r>
-        <w:t xml:space="preserve">The phrase 'Land Remediation Investigation Report: Land Remediation Investigation Report:' is repeated. Remove the redundant repetition.</w:t>
+  <w:comment w:id="4" w:author=" [MAJOR] Grammar and Spelling Check" w:date="2025-05-30T01:37:12Z" w:initials="AI">
+    <w:p>
+      <w:r>
+        <w:t xml:space="preserve">Correct the spelling error. 'developftent' should be 'development'.</w:t>
       </w:r>
     </w:p>
   </w:comment>
-  <w:comment w:id="5" w:author=" [MAJOR] Grammar and Spelling Check" w:date="2025-05-29T13:12:44Z" w:initials="AI">
-    <w:p>
-      <w:r>
-        <w:t xml:space="preserve">Correct the spelling error from 'developftent' to 'development'.</w:t>
+  <w:comment w:id="5" w:author=" [MAJOR] Grammar and Spelling Check" w:date="2025-05-30T01:37:12Z" w:initials="AI">
+    <w:p>
+      <w:r>
+        <w:t xml:space="preserve">Correct the spelling error. 'iftmediate' should be 'immediate'.</w:t>
       </w:r>
     </w:p>
   </w:comment>
-  <w:comment w:id="6" w:author=" [MAJOR] Grammar and Spelling Check" w:date="2025-05-29T13:12:44Z" w:initials="AI">
-    <w:p>
-      <w:r>
-        <w:t xml:space="preserve">Correct the spelling error from 'iftmediate' to 'immediate'.</w:t>
+  <w:comment w:id="6" w:author=" [MINOR] Units and Symbols Consistency" w:date="2025-05-30T01:37:24Z" w:initials="AI">
+    <w:p>
+      <w:r>
+        <w:t xml:space="preserve">Inconsistent unit usage. The report uses both 'psi' and 'kPa' for pressure/strength measurements. Standardize to one unit (preferably kPa for consistency with SI units) or provide conversions.</w:t>
       </w:r>
     </w:p>
   </w:comment>
-  <w:comment w:id="7" w:author=" [MINOR] Units and Symbols Consistency" w:date="2025-05-29T13:12:54Z" w:initials="AI">
+  <w:comment w:id="7" w:author=" [MAJOR] Grammar and Spelling Check" w:date="2025-05-30T01:37:12Z" w:initials="AI">
+    <w:p>
+      <w:r>
+        <w:t xml:space="preserve">There is an extra '1' at the end of 'NZS 3604:20111'. Remove the extra digit.</w:t>
+      </w:r>
+    </w:p>
+  </w:comment>
+  <w:comment w:id="8" w:author=" [MAJOR] Grammar and Spelling Check" w:date="2025-05-30T01:37:12Z" w:initials="AI">
+    <w:p>
+      <w:r>
+        <w:t xml:space="preserve">Correct the spelling error. 'paveftents' should be 'pavements'.</w:t>
+      </w:r>
+    </w:p>
+  </w:comment>
+  <w:comment w:id="9" w:author=" [MAJOR] Grammar and Spelling Check" w:date="2025-05-30T01:37:12Z" w:initials="AI">
+    <w:p>
+      <w:r>
+        <w:t xml:space="preserve">Correct the spelling error. 'ftoisture' should be 'moisture'.</w:t>
+      </w:r>
+    </w:p>
+  </w:comment>
+  <w:comment w:id="10" w:author=" [MAJOR] Grammar and Spelling Check" w:date="2025-05-30T01:37:12Z" w:initials="AI">
+    <w:p>
+      <w:r>
+        <w:t xml:space="preserve">Correct the spelling error. 'ftinimum' should be 'minimum'.</w:t>
+      </w:r>
+    </w:p>
+  </w:comment>
+  <w:comment w:id="11" w:author=" [MAJOR] Grammar and Spelling Check" w:date="2025-05-30T01:37:12Z" w:initials="AI">
+    <w:p>
+      <w:r>
+        <w:t xml:space="preserve">Correct the spelling error. 'daftage' should be 'damage'.</w:t>
+      </w:r>
+    </w:p>
+  </w:comment>
+  <w:comment w:id="12" w:author=" [MAJOR] Grammar and Spelling Check" w:date="2025-05-30T01:37:12Z" w:initials="AI">
+    <w:p>
+      <w:r>
+        <w:t xml:space="preserve">Correct the spelling error. 'Noveftber' should be 'November'.</w:t>
+      </w:r>
+    </w:p>
+  </w:comment>
+  <w:comment w:id="13" w:author=" [CRITICAL] Terminology Consistency" w:date="2025-05-30T01:37:31Z" w:initials="AI">
+    <w:p>
+      <w:r>
+        <w:t xml:space="preserve">The report uses both 'site-won soil' and 'site-won volcanic soils' to refer to the same concept. Standardize to one term, preferably 'site-won soil'.</w:t>
+      </w:r>
+    </w:p>
+  </w:comment>
+  <w:comment w:id="14" w:author=" [MAJOR] Grammar and Spelling Check" w:date="2025-05-30T01:37:12Z" w:initials="AI">
+    <w:p>
+      <w:r>
+        <w:t xml:space="preserve">Correct the spelling error. 'inforftation' should be 'information'.</w:t>
+      </w:r>
+    </w:p>
+  </w:comment>
+  <w:comment w:id="15" w:author=" [MINOR] Units and Symbols Consistency" w:date="2025-05-30T01:37:24Z" w:initials="AI">
     <w:p>
       <w:r>
         <w:t xml:space="preserve">Inconsistent unit usage. The report uses both 'psi' and 'kPa' for pressure/strength measurements. Standardize to one unit (preferably kPa for consistency with SI units) or provide conversions.</w:t>
       </w:r>
     </w:p>
   </w:comment>
-  <w:comment w:id="8" w:author=" [MAJOR] Grammar and Spelling Check" w:date="2025-05-29T13:12:44Z" w:initials="AI">
-    <w:p>
-      <w:r>
-        <w:t xml:space="preserve">Correct the spelling error from 'Coftpressible' to 'Compressible'.</w:t>
+  <w:comment w:id="16" w:author=" [CRITICAL] Terminology Consistency" w:date="2025-05-30T01:37:31Z" w:initials="AI">
+    <w:p>
+      <w:r>
+        <w:t xml:space="preserve">The report uses both 'expansive soils' and 'reactive soils' to refer to the same concept. Standardize to one term, preferably 'expansive soils'.</w:t>
       </w:r>
     </w:p>
   </w:comment>
-  <w:comment w:id="9" w:author=" [MAJOR] Grammar and Spelling Check" w:date="2025-05-29T13:12:44Z" w:initials="AI">
-    <w:p>
-      <w:r>
-        <w:t xml:space="preserve">Correct the spelling error from 'paveftents' to 'pavements'.</w:t>
+  <w:comment w:id="17" w:author=" [MAJOR] Grammar and Spelling Check" w:date="2025-05-30T01:37:12Z" w:initials="AI">
+    <w:p>
+      <w:r>
+        <w:t xml:space="preserve">The phrase 'A stiffened raft design in accordance with Class H2, extending a minimum of 600mm into the underlying natural soils.' is missing a full stop at the end.</w:t>
       </w:r>
     </w:p>
   </w:comment>
-  <w:comment w:id="10" w:author=" [CRITICAL] Terminology Consistency" w:date="2025-05-29T13:13:00Z" w:initials="AI">
-    <w:p>
-      <w:r>
-        <w:t xml:space="preserve">The term 'Superlot ZX-001' is sometimes referred to as 'Superlot MW – A58'. To maintain consistency, use 'Superlot ZX-001' throughout the report.</w:t>
+  <w:comment w:id="18" w:author=" [MAJOR] Grammar and Spelling Check" w:date="2025-05-30T01:37:12Z" w:initials="AI">
+    <w:p>
+      <w:r>
+        <w:t xml:space="preserve">Correct the spelling error. 'placeftent' should be 'placement'.</w:t>
       </w:r>
     </w:p>
   </w:comment>
-  <w:comment w:id="12" w:author=" [MAJOR] Grammar and Spelling Check" w:date="2025-05-29T13:12:44Z" w:initials="AI">
-    <w:p>
-      <w:r>
-        <w:t xml:space="preserve">In the sentence 'It is likely that the soils at the foundation elevation will be prone to shrinkage and swelling when exposed to changes in ftoisture content.', 'ftoisture' should be 'moisture'.</w:t>
+  <w:comment w:id="19" w:author=" [MAJOR] Grammar and Spelling Check" w:date="2025-05-30T01:37:12Z" w:initials="AI">
+    <w:p>
+      <w:r>
+        <w:t xml:space="preserve">Correct the spelling error. 'parafteters' should be 'parameters'.</w:t>
       </w:r>
     </w:p>
   </w:comment>
-  <w:comment w:id="11" w:author=" [MAJOR] Grammar and Spelling Check" w:date="2025-05-29T13:12:44Z" w:initials="AI">
-    <w:p>
-      <w:r>
-        <w:t xml:space="preserve">Correct the spelling error from 'ftoisture' to 'moisture'.</w:t>
+  <w:comment w:id="20" w:author=" [MAJOR] Grammar and Spelling Check" w:date="2025-05-30T01:37:12Z" w:initials="AI">
+    <w:p>
+      <w:r>
+        <w:t xml:space="preserve">There is an inconsistency in the numbering of figures. Figure 3 follows Figure 2, but Figure 1 is mentioned earlier in the document. Please check and correct the numbering.</w:t>
       </w:r>
     </w:p>
   </w:comment>
-  <w:comment w:id="13" w:author=" [MAJOR] Grammar and Spelling Check" w:date="2025-05-29T13:12:44Z" w:initials="AI">
-    <w:p>
-      <w:r>
-        <w:t xml:space="preserve">Correct the spelling error from 'ftinimum' to 'minimum'.</w:t>
+  <w:comment w:id="21" w:author=" [MAJOR] Grammar and Spelling Check" w:date="2025-05-30T01:37:12Z" w:initials="AI">
+    <w:p>
+      <w:r>
+        <w:t xml:space="preserve">Correct the spelling error. 'Assufting' should be 'Assuming'.</w:t>
       </w:r>
     </w:p>
   </w:comment>
-  <w:comment w:id="14" w:author=" [MAJOR] Grammar and Spelling Check" w:date="2025-05-29T13:12:44Z" w:initials="AI">
-    <w:p>
-      <w:r>
-        <w:t xml:space="preserve">Correct the spelling error from 'daftage' to 'damage'.</w:t>
+  <w:comment w:id="22" w:author=" [MAJOR] Grammar and Spelling Check" w:date="2025-05-30T01:37:12Z" w:initials="AI">
+    <w:p>
+      <w:r>
+        <w:t xml:space="preserve">Correct the spelling error. 'preliftinary' should be 'preliminary'.</w:t>
       </w:r>
     </w:p>
   </w:comment>
-  <w:comment w:id="15" w:author=" [MAJOR] Grammar and Spelling Check" w:date="2025-05-29T13:12:44Z" w:initials="AI">
-    <w:p>
-      <w:r>
-        <w:t xml:space="preserve">Correct the spelling error from 'Noveftber' to 'November'.</w:t>
-      </w:r>
-    </w:p>
-  </w:comment>
-  <w:comment w:id="16" w:author=" [CRITICAL] Terminology Consistency" w:date="2025-05-29T13:13:00Z" w:initials="AI">
-    <w:p>
-      <w:r>
-        <w:t xml:space="preserve">The terms 'engineered fill' and 'hardfill' are used interchangeably. Choose one term and use it consistently throughout the report.</w:t>
-      </w:r>
-    </w:p>
-  </w:comment>
-  <w:comment w:id="17" w:author=" [MAJOR] Grammar and Spelling Check" w:date="2025-05-29T13:12:44Z" w:initials="AI">
-    <w:p>
-      <w:r>
-        <w:t xml:space="preserve">Correct the spelling error from 'inforftation' to 'information'.</w:t>
-      </w:r>
-    </w:p>
-  </w:comment>
-  <w:comment w:id="18" w:author=" [CRITICAL] Terminology Consistency" w:date="2025-05-29T13:13:00Z" w:initials="AI">
-    <w:p>
-      <w:r>
-        <w:t xml:space="preserve">The terms 'shallow foundations', 'shallow pads' and 'strip footings' are used interchangeably. Choose one term and use it consistently throughout the report.</w:t>
-      </w:r>
-    </w:p>
-  </w:comment>
-  <w:comment w:id="19" w:author=" [MINOR] Units and Symbols Consistency" w:date="2025-05-29T13:12:55Z" w:initials="AI">
-    <w:p>
-      <w:r>
-        <w:t xml:space="preserve">Inconsistent unit usage. The report uses both 'psi' and 'kPa' for pressure/strength measurements. Standardize to one unit (preferably kPa for consistency with SI units) or provide conversions.</w:t>
-      </w:r>
-    </w:p>
-  </w:comment>
-  <w:comment w:id="20" w:author=" [MAJOR] Grammar and Spelling Check" w:date="2025-05-29T13:12:44Z" w:initials="AI">
-    <w:p>
-      <w:r>
-        <w:t xml:space="preserve">In the sentence 'For structures of greater than 20m length constructed on variable ground we recommend construction joints should be used to ftitigate the effects of differential foundation settlement.', 'ftitigate' should be 'mitigate'.</w:t>
-      </w:r>
-    </w:p>
-  </w:comment>
-  <w:comment w:id="21" w:author=" [CRITICAL] Terminology Consistency" w:date="2025-05-29T13:13:00Z" w:initials="AI">
-    <w:p>
-      <w:r>
-        <w:t xml:space="preserve">The terms 'expansive soils' and 'reactive soils' are used interchangeably. Choose one term and use it consistently throughout the report.</w:t>
-      </w:r>
-    </w:p>
-  </w:comment>
-  <w:comment w:id="22" w:author=" [MAJOR] Grammar and Spelling Check" w:date="2025-05-29T13:12:44Z" w:initials="AI">
-    <w:p>
-      <w:r>
-        <w:t xml:space="preserve">Correct the spelling error from 'placeftent' to 'placement'.</w:t>
-      </w:r>
-    </w:p>
-  </w:comment>
-  <w:comment w:id="23" w:author=" [MAJOR] Grammar and Spelling Check" w:date="2025-05-29T13:12:44Z" w:initials="AI">
-    <w:p>
-      <w:r>
-        <w:t xml:space="preserve">Correct the spelling error from 'parafteters' to 'parameters'.</w:t>
-      </w:r>
-    </w:p>
-  </w:comment>
-  <w:comment w:id="24" w:author=" [MAJOR] Grammar and Spelling Check" w:date="2025-05-29T13:12:44Z" w:initials="AI">
-    <w:p>
-      <w:r>
-        <w:t xml:space="preserve">Correct the spelling error from 'Assufting' to 'Assuming'.</w:t>
-      </w:r>
-    </w:p>
-  </w:comment>
-  <w:comment w:id="25" w:author=" [MAJOR] Grammar and Spelling Check" w:date="2025-05-29T13:12:44Z" w:initials="AI">
-    <w:p>
-      <w:r>
-        <w:t xml:space="preserve">Correct the spelling error from 'preliftinary' to 'preliminary'.</w:t>
-      </w:r>
-    </w:p>
-  </w:comment>
-  <w:comment w:id="26" w:author=" [MAJOR] Grammar and Spelling Check" w:date="2025-05-29T13:12:44Z" w:initials="AI">
-    <w:p>
-      <w:r>
-        <w:t xml:space="preserve">Correct the spelling error from 'forft' to 'form'.</w:t>
+  <w:comment w:id="23" w:author=" [MAJOR] Grammar and Spelling Check" w:date="2025-05-30T01:37:12Z" w:initials="AI">
+    <w:p>
+      <w:r>
+        <w:t xml:space="preserve">Correct the spelling error. 'forft' should be 'form'.</w:t>
       </w:r>
     </w:p>
   </w:comment>
@@ -24501,33 +24362,30 @@
 
 <file path=word/commentsExtended.xml><?xml version="1.0" encoding="utf-8"?>
 <w15:commentsEx xmlns:wpc="http://schemas.microsoft.com/office/word/2010/wordprocessingCanvas" xmlns:cx="http://schemas.microsoft.com/office/drawing/2014/chartex" xmlns:cx1="http://schemas.microsoft.com/office/drawing/2015/9/8/chartex" xmlns:cx2="http://schemas.microsoft.com/office/drawing/2015/10/21/chartex" xmlns:cx3="http://schemas.microsoft.com/office/drawing/2016/5/9/chartex" xmlns:cx4="http://schemas.microsoft.com/office/drawing/2016/5/10/chartex" xmlns:cx5="http://schemas.microsoft.com/office/drawing/2016/5/11/chartex" xmlns:mc="http://schemas.openxmlformats.org/markup-compatibility/2006" xmlns:o="urn:schemas-microsoft-com:office:office" xmlns:r="http://schemas.openxmlformats.org/officeDocument/2006/relationships" xmlns:m="http://schemas.openxmlformats.org/officeDocument/2006/math" xmlns:v="urn:schemas-microsoft-com:vml" xmlns:wp14="http://schemas.microsoft.com/office/word/2010/wordprocessingDrawing" xmlns:wp="http://schemas.openxmlformats.org/drawingml/2006/wordprocessingDrawing" xmlns:w10="urn:schemas-microsoft-com:office:word" xmlns:w="http://schemas.openxmlformats.org/wordprocessingml/2006/main" xmlns:w14="http://schemas.microsoft.com/office/word/2010/wordml" xmlns:w15="http://schemas.microsoft.com/office/word/2012/wordml" xmlns:wne="http://schemas.microsoft.com/office/word/2006/wordml" xmlns:wpg="http://schemas.microsoft.com/office/word/2010/wordprocessingGroup" xmlns:wpi="http://schemas.microsoft.com/office/word/2010/wordprocessingInk" xmlns:wps="http://schemas.microsoft.com/office/word/2010/wordprocessingShape" mc:Ignorable="w14 w15 wp14">
-  <w15:commentEx w15:paraId="711FBFFA" w15:done="0"/>
-  <w15:commentEx w15:paraId="26701326" w15:done="0"/>
-  <w15:commentEx w15:paraId="DC4C1401" w15:done="0"/>
-  <w15:commentEx w15:paraId="5AB2D3E0" w15:done="0"/>
-  <w15:commentEx w15:paraId="0FAB482B" w15:done="0"/>
-  <w15:commentEx w15:paraId="7EC8FC95" w15:done="0"/>
-  <w15:commentEx w15:paraId="EBFCE778" w15:done="0"/>
-  <w15:commentEx w15:paraId="3A9CD5D2" w15:done="0"/>
-  <w15:commentEx w15:paraId="B43D3EA2" w15:done="0"/>
-  <w15:commentEx w15:paraId="CB101CC9" w15:done="0"/>
-  <w15:commentEx w15:paraId="9FEB4EDA" w15:done="0"/>
-  <w15:commentEx w15:paraId="2E6CEF73" w15:done="0"/>
-  <w15:commentEx w15:paraId="D853F1D1" w15:done="0"/>
-  <w15:commentEx w15:paraId="AC292DC4" w15:done="0"/>
-  <w15:commentEx w15:paraId="317A3701" w15:done="0"/>
-  <w15:commentEx w15:paraId="63EFC133" w15:done="0"/>
-  <w15:commentEx w15:paraId="0BE570DE" w15:done="0"/>
-  <w15:commentEx w15:paraId="7CEC70A9" w15:done="0"/>
-  <w15:commentEx w15:paraId="E6B0F34E" w15:done="0"/>
-  <w15:commentEx w15:paraId="1526A4DB" w15:done="0"/>
-  <w15:commentEx w15:paraId="30C5B9C6" w15:done="0"/>
-  <w15:commentEx w15:paraId="EFA03748" w15:done="0"/>
-  <w15:commentEx w15:paraId="FEB55F49" w15:done="0"/>
-  <w15:commentEx w15:paraId="92A7106A" w15:done="0"/>
-  <w15:commentEx w15:paraId="F2B2EB02" w15:done="0"/>
-  <w15:commentEx w15:paraId="55BDCD04" w15:done="0"/>
-  <w15:commentEx w15:paraId="1A025F92" w15:done="0"/>
+  <w15:commentEx w15:paraId="1A1EFE78" w15:done="0"/>
+  <w15:commentEx w15:paraId="3A2C37C6" w15:done="0"/>
+  <w15:commentEx w15:paraId="DA9AEF7F" w15:done="0"/>
+  <w15:commentEx w15:paraId="DBCCFB87" w15:done="0"/>
+  <w15:commentEx w15:paraId="18C4FE11" w15:done="0"/>
+  <w15:commentEx w15:paraId="6C369E32" w15:done="0"/>
+  <w15:commentEx w15:paraId="737E02C6" w15:done="0"/>
+  <w15:commentEx w15:paraId="3EED89E4" w15:done="0"/>
+  <w15:commentEx w15:paraId="25E5135E" w15:done="0"/>
+  <w15:commentEx w15:paraId="3FD06369" w15:done="0"/>
+  <w15:commentEx w15:paraId="46548ABF" w15:done="0"/>
+  <w15:commentEx w15:paraId="7C7061C3" w15:done="0"/>
+  <w15:commentEx w15:paraId="8E99E4EE" w15:done="0"/>
+  <w15:commentEx w15:paraId="45D469F0" w15:done="0"/>
+  <w15:commentEx w15:paraId="DE8E26D2" w15:done="0"/>
+  <w15:commentEx w15:paraId="9E822E1A" w15:done="0"/>
+  <w15:commentEx w15:paraId="1B97E3B0" w15:done="0"/>
+  <w15:commentEx w15:paraId="18A905B9" w15:done="0"/>
+  <w15:commentEx w15:paraId="6FEA6EFC" w15:done="0"/>
+  <w15:commentEx w15:paraId="B7CD9FCD" w15:done="0"/>
+  <w15:commentEx w15:paraId="19B08B12" w15:done="0"/>
+  <w15:commentEx w15:paraId="9DB6EAC0" w15:done="0"/>
+  <w15:commentEx w15:paraId="EC15EE53" w15:done="0"/>
+  <w15:commentEx w15:paraId="9B8B0518" w15:done="0"/>
 </w15:commentsEx>
 </file>
 
@@ -28535,7 +28393,7 @@
     <w:nsid w:val="00000003"/>
     <w:multiLevelType w:val="multilevel"/>
     <w:tmpl w:val="00000000"/>
-    <w:name w:val="Numbered_1f16447f-69ad-4ded-92f8-8e4fb6eb52ac"/>
+    <w:name w:val="Numbered_c0a0dc69-1ec4-485e-9d23-d172a15b4a01"/>
     <w:lvl w:ilvl="0">
       <w:start w:val="1"/>
       <w:numFmt w:val="decimal"/>
@@ -28649,7 +28507,7 @@
     <w:nsid w:val="00000004"/>
     <w:multiLevelType w:val="multilevel"/>
     <w:tmpl w:val="00000000"/>
-    <w:name w:val="Bulleted_c1e55de5-dd6e-4c61-9c7f-90ab813592dc"/>
+    <w:name w:val="Bulleted_97070f46-3a75-4db3-b672-7d7695f8ce01"/>
     <w:lvl w:ilvl="0">
       <w:start w:val="1"/>
       <w:numFmt w:val="bullet"/>
@@ -28771,7 +28629,7 @@
     <w:nsid w:val="00000005"/>
     <w:multiLevelType w:val="multilevel"/>
     <w:tmpl w:val="00000000"/>
-    <w:name w:val="Numbered_64afe439-d999-4d9b-a3d8-62a888a483c4"/>
+    <w:name w:val="Numbered_64210a67-e2b0-4a9a-b272-a1f51f59a170"/>
     <w:lvl w:ilvl="0">
       <w:start w:val="1"/>
       <w:numFmt w:val="decimal"/>
@@ -28885,7 +28743,7 @@
     <w:nsid w:val="00000006"/>
     <w:multiLevelType w:val="multilevel"/>
     <w:tmpl w:val="00000000"/>
-    <w:name w:val="Bulleted_c5b7dd2c-3b82-423a-8c21-8927047b289a"/>
+    <w:name w:val="Bulleted_7b5c2463-7f72-4c0f-b6c0-b28290508eb7"/>
     <w:lvl w:ilvl="0">
       <w:start w:val="1"/>
       <w:numFmt w:val="bullet"/>
@@ -29007,7 +28865,7 @@
     <w:nsid w:val="00000007"/>
     <w:multiLevelType w:val="multilevel"/>
     <w:tmpl w:val="00000000"/>
-    <w:name w:val="Numbered_0e11d394-69e6-46e9-adc3-2aedff2d4f49"/>
+    <w:name w:val="Numbered_0a39a4b3-476a-45b8-9d1a-e17bc7392b8d"/>
     <w:lvl w:ilvl="0">
       <w:start w:val="1"/>
       <w:numFmt w:val="decimal"/>
@@ -29121,7 +28979,7 @@
     <w:nsid w:val="00000008"/>
     <w:multiLevelType w:val="multilevel"/>
     <w:tmpl w:val="00000000"/>
-    <w:name w:val="Bulleted_5c3ad6f9-eef4-49a5-aa35-6d433e059048"/>
+    <w:name w:val="Bulleted_e8d32b75-a56a-448c-9443-41d564a81d58"/>
     <w:lvl w:ilvl="0">
       <w:start w:val="1"/>
       <w:numFmt w:val="bullet"/>
@@ -29243,7 +29101,7 @@
     <w:nsid w:val="00000009"/>
     <w:multiLevelType w:val="multilevel"/>
     <w:tmpl w:val="00000000"/>
-    <w:name w:val="Numbered_6a9946b1-6a94-4283-bfed-4acc29373b6f"/>
+    <w:name w:val="Numbered_833e9959-6f4a-40ba-a840-ab26aa8f8f4d"/>
     <w:lvl w:ilvl="0">
       <w:start w:val="1"/>
       <w:numFmt w:val="decimal"/>
@@ -29357,7 +29215,7 @@
     <w:nsid w:val="0000000A"/>
     <w:multiLevelType w:val="multilevel"/>
     <w:tmpl w:val="00000000"/>
-    <w:name w:val="Bulleted_4a832db3-77a8-43bd-a6ef-5412bfda4c03"/>
+    <w:name w:val="Bulleted_6ef384de-c5d9-4573-a21a-595f4ab292c1"/>
     <w:lvl w:ilvl="0">
       <w:start w:val="1"/>
       <w:numFmt w:val="bullet"/>
@@ -29479,7 +29337,7 @@
     <w:nsid w:val="0000000B"/>
     <w:multiLevelType w:val="multilevel"/>
     <w:tmpl w:val="23469D34"/>
-    <w:name w:val="Numbered_be35f9dc-3161-4148-a575-7fb9df74c65f"/>
+    <w:name w:val="Numbered_fe289e66-438a-421c-a48a-f8b8385ee200"/>
     <w:lvl w:ilvl="0">
       <w:start w:val="2"/>
       <w:numFmt w:val="decimal"/>
@@ -29649,7 +29507,7 @@
     <w:nsid w:val="0000000C"/>
     <w:multiLevelType w:val="hybridMultilevel"/>
     <w:tmpl w:val="27008992"/>
-    <w:name w:val="Bulleted_7856bf2b-ff4a-4f95-85b6-72e839bec2a9"/>
+    <w:name w:val="Bulleted_2c5814ac-ca4f-4a8c-90ce-26a85fb40a37"/>
     <w:lvl w:ilvl="0">
       <w:start w:val="0"/>
       <w:numFmt w:val="bullet"/>
@@ -29780,7 +29638,7 @@
     <w:nsid w:val="0000000D"/>
     <w:multiLevelType w:val="hybridMultilevel"/>
     <w:tmpl w:val="0B62F06A"/>
-    <w:name w:val="Numbered_0c808c55-6e03-4588-9669-6707a3ed2427"/>
+    <w:name w:val="Numbered_1ead4d6b-2b8b-419c-a7f6-e93fda61f726"/>
     <w:lvl w:ilvl="0">
       <w:start w:val="1"/>
       <w:numFmt w:val="lowerLetter"/>
@@ -29912,7 +29770,7 @@
     <w:nsid w:val="0000000E"/>
     <w:multiLevelType w:val="hybridMultilevel"/>
     <w:tmpl w:val="496E7C1E"/>
-    <w:name w:val="Bulleted_c21885d5-53cd-4ea7-a65f-1a56deb6a7a6"/>
+    <w:name w:val="Bulleted_f2795ce8-bc5d-4cd3-be44-e934e7926185"/>
     <w:lvl w:ilvl="0">
       <w:start w:val="0"/>
       <w:numFmt w:val="bullet"/>
@@ -30044,7 +29902,7 @@
     <w:nsid w:val="0000000F"/>
     <w:multiLevelType w:val="hybridMultilevel"/>
     <w:tmpl w:val="6F906604"/>
-    <w:name w:val="Bulleted_2ba24f68-c59e-4e1b-8319-baefdb228b95"/>
+    <w:name w:val="Bulleted_825c938e-7b4b-4806-9013-57a0767fa82c"/>
     <w:lvl w:ilvl="0">
       <w:start w:val="0"/>
       <w:numFmt w:val="bullet"/>
@@ -30176,7 +30034,7 @@
     <w:nsid w:val="00000010"/>
     <w:multiLevelType w:val="hybridMultilevel"/>
     <w:tmpl w:val="1082B51C"/>
-    <w:name w:val="Numbered_ef3fc420-d695-4724-b2f2-02706994e7cc"/>
+    <w:name w:val="Numbered_45f1867f-5cad-40e2-828a-e158e7a87932"/>
     <w:lvl w:ilvl="0">
       <w:start w:val="1"/>
       <w:numFmt w:val="decimal"/>
@@ -30308,7 +30166,7 @@
     <w:nsid w:val="00000011"/>
     <w:multiLevelType w:val="multilevel"/>
     <w:tmpl w:val="D714C610"/>
-    <w:name w:val="Numbered_37b0a48b-d86d-44dd-84cd-ad8cd6cebd1b"/>
+    <w:name w:val="Numbered_9c76ccee-4d97-4c98-b7a2-33b95fe883d1"/>
     <w:lvl w:ilvl="0">
       <w:start w:val="1"/>
       <w:numFmt w:val="decimal"/>
@@ -30458,7 +30316,7 @@
     <w:nsid w:val="00000012"/>
     <w:multiLevelType w:val="hybridMultilevel"/>
     <w:tmpl w:val="2B9EBE96"/>
-    <w:name w:val="Numbered_a693fe58-08f3-4d54-8360-6af9976afa9d"/>
+    <w:name w:val="Numbered_69b1d193-7626-41e1-b166-bc3006b8ba65"/>
     <w:lvl w:ilvl="0">
       <w:start w:val="1"/>
       <w:numFmt w:val="decimal"/>
@@ -30584,7 +30442,7 @@
     <w:nsid w:val="00000013"/>
     <w:multiLevelType w:val="hybridMultilevel"/>
     <w:tmpl w:val="1E308D1C"/>
-    <w:name w:val="Numbered_bcf7bb63-e73f-433e-aed2-c9b91756abb1"/>
+    <w:name w:val="Numbered_fa976722-600c-4c49-8102-2ac42bc768f3"/>
     <w:lvl w:ilvl="0">
       <w:start w:val="1"/>
       <w:numFmt w:val="decimal"/>
@@ -30710,7 +30568,7 @@
     <w:nsid w:val="00000014"/>
     <w:multiLevelType w:val="multilevel"/>
     <w:tmpl w:val="6FD6E8B0"/>
-    <w:name w:val="Numbered_b1f81a69-95e5-4969-97d3-88f1f2064b53"/>
+    <w:name w:val="Numbered_21f81d0a-5089-45a2-bada-848ac772427a"/>
     <w:lvl w:ilvl="0">
       <w:start w:val="1"/>
       <w:numFmt w:val="decimal"/>
@@ -30852,7 +30710,7 @@
     <w:nsid w:val="00000015"/>
     <w:multiLevelType w:val="hybridMultilevel"/>
     <w:tmpl w:val="1D522390"/>
-    <w:name w:val="Numbered_d2c565fd-aace-4289-8e5b-176f7120fef3"/>
+    <w:name w:val="Numbered_3d05b731-dc63-4e29-9e25-0e79670298ca"/>
     <w:lvl w:ilvl="0">
       <w:start w:val="1"/>
       <w:numFmt w:val="decimal"/>
@@ -30978,7 +30836,7 @@
     <w:nsid w:val="00000016"/>
     <w:multiLevelType w:val="hybridMultilevel"/>
     <w:tmpl w:val="29E21FEC"/>
-    <w:name w:val="Bulleted_7c79d0b2-b1f2-40dc-a4af-0f6f71fc8b59"/>
+    <w:name w:val="Bulleted_e74f258d-a7f0-48d8-a124-fc189c86f062"/>
     <w:lvl w:ilvl="0">
       <w:start w:val="0"/>
       <w:numFmt w:val="bullet"/>
@@ -31110,7 +30968,7 @@
     <w:nsid w:val="00000017"/>
     <w:multiLevelType w:val="multilevel"/>
     <w:tmpl w:val="AE8E33B6"/>
-    <w:name w:val="Numbered_0eeb0617-cc3a-4427-900f-f24a7833025b"/>
+    <w:name w:val="Numbered_480356d7-4364-416c-8738-cee20111624a"/>
     <w:lvl w:ilvl="0">
       <w:start w:val="2"/>
       <w:numFmt w:val="decimal"/>
@@ -31243,7 +31101,7 @@
     <w:nsid w:val="00000018"/>
     <w:multiLevelType w:val="hybridMultilevel"/>
     <w:tmpl w:val="3414510A"/>
-    <w:name w:val="Bulleted_8499653a-ebb6-45fa-8d7b-d44d1e93b1e1"/>
+    <w:name w:val="Bulleted_4fec2130-333e-477e-9ca3-a63f037c02b2"/>
     <w:lvl w:ilvl="0">
       <w:start w:val="0"/>
       <w:numFmt w:val="bullet"/>

</xml_diff>